<commit_message>
Completed implementation of hw4
</commit_message>
<xml_diff>
--- a/Homework 4 Analysis of 3 Way Implementation.docx
+++ b/Homework 4 Analysis of 3 Way Implementation.docx
@@ -53,6 +53,87 @@
           <w:rFonts w:ascii="Times New Roman" w:hAnsi="Times New Roman" w:cs="Times New Roman"/>
         </w:rPr>
       </w:pPr>
+      <w:r>
+        <w:rPr>
+          <w:rFonts w:ascii="Times New Roman" w:hAnsi="Times New Roman" w:cs="Times New Roman"/>
+        </w:rPr>
+        <w:t>Introduction</w:t>
+      </w:r>
+    </w:p>
+    <w:p>
+      <w:pPr>
+        <w:pStyle w:val="ListParagraph"/>
+        <w:ind w:firstLine="720"/>
+        <w:rPr>
+          <w:rFonts w:ascii="Times New Roman" w:hAnsi="Times New Roman" w:cs="Times New Roman"/>
+        </w:rPr>
+      </w:pPr>
+      <w:r>
+        <w:rPr>
+          <w:rFonts w:ascii="Times New Roman" w:hAnsi="Times New Roman" w:cs="Times New Roman"/>
+        </w:rPr>
+        <w:t>The following describes the differences between three implementations to find the max ASCII value per line for a specified number of lines read. For all tests in all sections each test was run 5 times and the average of all of those were taken and used as points on the graph as visualizations. Not every test was r</w:t>
+      </w:r>
+      <w:r>
+        <w:rPr>
+          <w:rFonts w:ascii="Times New Roman" w:hAnsi="Times New Roman" w:cs="Times New Roman"/>
+        </w:rPr>
+        <w:t>u</w:t>
+      </w:r>
+      <w:r>
+        <w:rPr>
+          <w:rFonts w:ascii="Times New Roman" w:hAnsi="Times New Roman" w:cs="Times New Roman"/>
+        </w:rPr>
+        <w:t xml:space="preserve">n exactly 5 times as sometimes the queue was </w:t>
+      </w:r>
+      <w:r>
+        <w:rPr>
+          <w:rFonts w:ascii="Times New Roman" w:hAnsi="Times New Roman" w:cs="Times New Roman"/>
+        </w:rPr>
+        <w:t>filled</w:t>
+      </w:r>
+      <w:r>
+        <w:rPr>
+          <w:rFonts w:ascii="Times New Roman" w:hAnsi="Times New Roman" w:cs="Times New Roman"/>
+        </w:rPr>
+        <w:t xml:space="preserve"> with other jobs causing big influxes in numbers. For that </w:t>
+      </w:r>
+      <w:r>
+        <w:rPr>
+          <w:rFonts w:ascii="Times New Roman" w:hAnsi="Times New Roman" w:cs="Times New Roman"/>
+        </w:rPr>
+        <w:t>purpose,</w:t>
+      </w:r>
+      <w:r>
+        <w:rPr>
+          <w:rFonts w:ascii="Times New Roman" w:hAnsi="Times New Roman" w:cs="Times New Roman"/>
+        </w:rPr>
+        <w:t xml:space="preserve"> those numbers were considered outliers and dropped </w:t>
+      </w:r>
+      <w:r>
+        <w:rPr>
+          <w:rFonts w:ascii="Times New Roman" w:hAnsi="Times New Roman" w:cs="Times New Roman"/>
+        </w:rPr>
+        <w:t>to</w:t>
+      </w:r>
+      <w:r>
+        <w:rPr>
+          <w:rFonts w:ascii="Times New Roman" w:hAnsi="Times New Roman" w:cs="Times New Roman"/>
+        </w:rPr>
+        <w:t xml:space="preserve"> get accurate data. The lines read where from a big file of Wikipedia links.</w:t>
+      </w:r>
+    </w:p>
+    <w:p>
+      <w:pPr>
+        <w:pStyle w:val="ListParagraph"/>
+        <w:numPr>
+          <w:ilvl w:val="0"/>
+          <w:numId w:val="1"/>
+        </w:numPr>
+        <w:rPr>
+          <w:rFonts w:ascii="Times New Roman" w:hAnsi="Times New Roman" w:cs="Times New Roman"/>
+        </w:rPr>
+      </w:pPr>
       <w:proofErr w:type="spellStart"/>
       <w:r>
         <w:rPr>
@@ -112,7 +193,7 @@
         <w:rPr>
           <w:rFonts w:ascii="Times New Roman" w:hAnsi="Times New Roman" w:cs="Times New Roman"/>
         </w:rPr>
-        <w:t xml:space="preserve"> it on a </w:t>
+        <w:t xml:space="preserve"> on a </w:t>
       </w:r>
       <w:r>
         <w:rPr>
@@ -124,25 +205,25 @@
         <w:rPr>
           <w:rFonts w:ascii="Times New Roman" w:hAnsi="Times New Roman" w:cs="Times New Roman"/>
         </w:rPr>
-        <w:t xml:space="preserve"> only</w:t>
-      </w:r>
-      <w:r>
-        <w:rPr>
-          <w:rFonts w:ascii="Times New Roman" w:hAnsi="Times New Roman" w:cs="Times New Roman"/>
-        </w:rPr>
-        <w:t xml:space="preserve"> uses</w:t>
-      </w:r>
-      <w:r>
-        <w:rPr>
-          <w:rFonts w:ascii="Times New Roman" w:hAnsi="Times New Roman" w:cs="Times New Roman"/>
-        </w:rPr>
-        <w:t xml:space="preserve"> one process and not a whole cluster </w:t>
-      </w:r>
-      <w:r>
-        <w:rPr>
-          <w:rFonts w:ascii="Times New Roman" w:hAnsi="Times New Roman" w:cs="Times New Roman"/>
-        </w:rPr>
-        <w:t xml:space="preserve">of processes. Only using one process means that only one node can be used. To test the speed of </w:t>
+        <w:t xml:space="preserve"> only one process and not a whole cluster </w:t>
+      </w:r>
+      <w:r>
+        <w:rPr>
+          <w:rFonts w:ascii="Times New Roman" w:hAnsi="Times New Roman" w:cs="Times New Roman"/>
+        </w:rPr>
+        <w:t>of processes</w:t>
+      </w:r>
+      <w:r>
+        <w:rPr>
+          <w:rFonts w:ascii="Times New Roman" w:hAnsi="Times New Roman" w:cs="Times New Roman"/>
+        </w:rPr>
+        <w:t xml:space="preserve"> are used</w:t>
+      </w:r>
+      <w:r>
+        <w:rPr>
+          <w:rFonts w:ascii="Times New Roman" w:hAnsi="Times New Roman" w:cs="Times New Roman"/>
+        </w:rPr>
+        <w:t xml:space="preserve">. Only using one process means that only one node can be used. To test the speed of </w:t>
       </w:r>
       <w:proofErr w:type="spellStart"/>
       <w:r>
@@ -180,79 +261,7 @@
         <w:rPr>
           <w:rFonts w:ascii="Times New Roman" w:hAnsi="Times New Roman" w:cs="Times New Roman"/>
         </w:rPr>
-        <w:t>, amount of memory being used, and how many lines are read from our huge file. Each type of test was r</w:t>
-      </w:r>
-      <w:r>
-        <w:rPr>
-          <w:rFonts w:ascii="Times New Roman" w:hAnsi="Times New Roman" w:cs="Times New Roman"/>
-        </w:rPr>
-        <w:t>u</w:t>
-      </w:r>
-      <w:r>
-        <w:rPr>
-          <w:rFonts w:ascii="Times New Roman" w:hAnsi="Times New Roman" w:cs="Times New Roman"/>
-        </w:rPr>
-        <w:t xml:space="preserve">n </w:t>
-      </w:r>
-      <w:r>
-        <w:rPr>
-          <w:rFonts w:ascii="Times New Roman" w:hAnsi="Times New Roman" w:cs="Times New Roman"/>
-        </w:rPr>
-        <w:t>five</w:t>
-      </w:r>
-      <w:r>
-        <w:rPr>
-          <w:rFonts w:ascii="Times New Roman" w:hAnsi="Times New Roman" w:cs="Times New Roman"/>
-        </w:rPr>
-        <w:t xml:space="preserve"> times and the averages of those were compute</w:t>
-      </w:r>
-      <w:r>
-        <w:rPr>
-          <w:rFonts w:ascii="Times New Roman" w:hAnsi="Times New Roman" w:cs="Times New Roman"/>
-        </w:rPr>
-        <w:t>d</w:t>
-      </w:r>
-      <w:r>
-        <w:rPr>
-          <w:rFonts w:ascii="Times New Roman" w:hAnsi="Times New Roman" w:cs="Times New Roman"/>
-        </w:rPr>
-        <w:t xml:space="preserve"> for the purpose of the graphs in this </w:t>
-      </w:r>
-      <w:r>
-        <w:rPr>
-          <w:rFonts w:ascii="Times New Roman" w:hAnsi="Times New Roman" w:cs="Times New Roman"/>
-        </w:rPr>
-        <w:t>section</w:t>
-      </w:r>
-      <w:r>
-        <w:rPr>
-          <w:rFonts w:ascii="Times New Roman" w:hAnsi="Times New Roman" w:cs="Times New Roman"/>
-        </w:rPr>
-        <w:t xml:space="preserve">. Two types of each test </w:t>
-      </w:r>
-      <w:r>
-        <w:rPr>
-          <w:rFonts w:ascii="Times New Roman" w:hAnsi="Times New Roman" w:cs="Times New Roman"/>
-        </w:rPr>
-        <w:t>were</w:t>
-      </w:r>
-      <w:r>
-        <w:rPr>
-          <w:rFonts w:ascii="Times New Roman" w:hAnsi="Times New Roman" w:cs="Times New Roman"/>
-        </w:rPr>
-        <w:t xml:space="preserve"> </w:t>
-      </w:r>
-      <w:r>
-        <w:rPr>
-          <w:rFonts w:ascii="Times New Roman" w:hAnsi="Times New Roman" w:cs="Times New Roman"/>
-        </w:rPr>
-        <w:t>run</w:t>
-      </w:r>
-      <w:r>
-        <w:rPr>
-          <w:rFonts w:ascii="Times New Roman" w:hAnsi="Times New Roman" w:cs="Times New Roman"/>
-        </w:rPr>
-        <w:t xml:space="preserve"> on different parameters to see how different variables affect the performance of the system. </w:t>
+        <w:t xml:space="preserve">, amount of memory being used, and how many lines are read from our huge file. </w:t>
       </w:r>
       <w:r>
         <w:rPr>
@@ -692,14 +701,6 @@
           <w:rFonts w:ascii="Times New Roman" w:hAnsi="Times New Roman" w:cs="Times New Roman"/>
         </w:rPr>
       </w:pPr>
-    </w:p>
-    <w:p>
-      <w:pPr>
-        <w:pStyle w:val="ListParagraph"/>
-        <w:rPr>
-          <w:rFonts w:ascii="Times New Roman" w:hAnsi="Times New Roman" w:cs="Times New Roman"/>
-        </w:rPr>
-      </w:pPr>
       <w:r>
         <w:rPr>
           <w:rFonts w:ascii="Times New Roman" w:hAnsi="Times New Roman" w:cs="Times New Roman"/>
@@ -908,40 +909,2011 @@
         <w:rPr>
           <w:rFonts w:ascii="Times New Roman" w:hAnsi="Times New Roman" w:cs="Times New Roman"/>
         </w:rPr>
-        <w:t xml:space="preserve"> what was noticed is that when there was a peak of jobs being run on the system there was a fair </w:t>
+        <w:t xml:space="preserve"> what was noticed is that when there was a peak </w:t>
+      </w:r>
+      <w:r>
+        <w:rPr>
+          <w:rFonts w:ascii="Times New Roman" w:hAnsi="Times New Roman" w:cs="Times New Roman"/>
+        </w:rPr>
+        <w:t>in</w:t>
+      </w:r>
+      <w:r>
+        <w:rPr>
+          <w:rFonts w:ascii="Times New Roman" w:hAnsi="Times New Roman" w:cs="Times New Roman"/>
+        </w:rPr>
+        <w:t xml:space="preserve"> jobs being run on the system there was a fair </w:t>
+      </w:r>
+      <w:r>
+        <w:rPr>
+          <w:rFonts w:ascii="Times New Roman" w:hAnsi="Times New Roman" w:cs="Times New Roman"/>
+        </w:rPr>
+        <w:t>number</w:t>
+      </w:r>
+      <w:r>
+        <w:rPr>
+          <w:rFonts w:ascii="Times New Roman" w:hAnsi="Times New Roman" w:cs="Times New Roman"/>
+        </w:rPr>
+        <w:t xml:space="preserve"> of inconsistencies with the data. Too big to be considered for the averages shown in the </w:t>
+      </w:r>
+      <w:r>
+        <w:rPr>
+          <w:rFonts w:ascii="Times New Roman" w:hAnsi="Times New Roman" w:cs="Times New Roman"/>
+        </w:rPr>
+        <w:lastRenderedPageBreak/>
+        <w:t xml:space="preserve">graphs as the times were jumping all around. For that purpose, those times were considered outliers and dropped for the </w:t>
+      </w:r>
+      <w:r>
+        <w:rPr>
+          <w:rFonts w:ascii="Times New Roman" w:hAnsi="Times New Roman" w:cs="Times New Roman"/>
+        </w:rPr>
+        <w:t>purpose</w:t>
+      </w:r>
+      <w:r>
+        <w:rPr>
+          <w:rFonts w:ascii="Times New Roman" w:hAnsi="Times New Roman" w:cs="Times New Roman"/>
+        </w:rPr>
+        <w:t xml:space="preserve"> of having the most consistent data.</w:t>
+      </w:r>
+    </w:p>
+    <w:p>
+      <w:pPr>
+        <w:pStyle w:val="ListParagraph"/>
+        <w:rPr>
+          <w:rFonts w:ascii="Times New Roman" w:hAnsi="Times New Roman" w:cs="Times New Roman"/>
+        </w:rPr>
+      </w:pPr>
+    </w:p>
+    <w:p>
+      <w:pPr>
+        <w:pStyle w:val="ListParagraph"/>
+        <w:numPr>
+          <w:ilvl w:val="0"/>
+          <w:numId w:val="1"/>
+        </w:numPr>
+        <w:rPr>
+          <w:rFonts w:ascii="Times New Roman" w:hAnsi="Times New Roman" w:cs="Times New Roman"/>
+        </w:rPr>
+      </w:pPr>
+      <w:r>
+        <w:rPr>
+          <w:rFonts w:ascii="Times New Roman" w:hAnsi="Times New Roman" w:cs="Times New Roman"/>
+        </w:rPr>
+        <w:t>MPI</w:t>
+      </w:r>
+    </w:p>
+    <w:p>
+      <w:pPr>
+        <w:pStyle w:val="ListParagraph"/>
+        <w:ind w:firstLine="720"/>
+        <w:rPr>
+          <w:rFonts w:ascii="Times New Roman" w:hAnsi="Times New Roman" w:cs="Times New Roman"/>
+        </w:rPr>
+      </w:pPr>
+      <w:r>
+        <w:rPr>
+          <w:rFonts w:ascii="Times New Roman" w:hAnsi="Times New Roman" w:cs="Times New Roman"/>
+        </w:rPr>
+        <w:t xml:space="preserve">MPI splits work between multiple machines </w:t>
+      </w:r>
+      <w:r>
+        <w:rPr>
+          <w:rFonts w:ascii="Times New Roman" w:hAnsi="Times New Roman" w:cs="Times New Roman"/>
+        </w:rPr>
+        <w:t>to</w:t>
+      </w:r>
+      <w:r>
+        <w:rPr>
+          <w:rFonts w:ascii="Times New Roman" w:hAnsi="Times New Roman" w:cs="Times New Roman"/>
+        </w:rPr>
+        <w:t xml:space="preserve"> get large amounts of work done without overwhelming just one machine. This causes more overhead for smaller jobs </w:t>
+      </w:r>
+      <w:r>
+        <w:rPr>
+          <w:rFonts w:ascii="Times New Roman" w:hAnsi="Times New Roman" w:cs="Times New Roman"/>
+        </w:rPr>
+        <w:t xml:space="preserve">causing </w:t>
+      </w:r>
+      <w:r>
+        <w:rPr>
+          <w:rFonts w:ascii="Times New Roman" w:hAnsi="Times New Roman" w:cs="Times New Roman"/>
+        </w:rPr>
+        <w:t>them</w:t>
+      </w:r>
+      <w:r>
+        <w:rPr>
+          <w:rFonts w:ascii="Times New Roman" w:hAnsi="Times New Roman" w:cs="Times New Roman"/>
+        </w:rPr>
+        <w:t xml:space="preserve"> to be worse in some cases.</w:t>
+      </w:r>
+      <w:r>
+        <w:rPr>
+          <w:rFonts w:ascii="Times New Roman" w:hAnsi="Times New Roman" w:cs="Times New Roman"/>
+        </w:rPr>
+        <w:t xml:space="preserve"> The first test ran was on the thread count. One test was r</w:t>
+      </w:r>
+      <w:r>
+        <w:rPr>
+          <w:rFonts w:ascii="Times New Roman" w:hAnsi="Times New Roman" w:cs="Times New Roman"/>
+        </w:rPr>
+        <w:t>u</w:t>
+      </w:r>
+      <w:r>
+        <w:rPr>
+          <w:rFonts w:ascii="Times New Roman" w:hAnsi="Times New Roman" w:cs="Times New Roman"/>
+        </w:rPr>
+        <w:t>n with 4GB of memory reading 500 thousand lines, the second used 3GB of memory on 1 million lines of data.</w:t>
+      </w:r>
+    </w:p>
+    <w:p>
+      <w:pPr>
+        <w:pStyle w:val="ListParagraph"/>
+        <w:tabs>
+          <w:tab w:val="right" w:pos="9360"/>
+        </w:tabs>
+        <w:rPr>
+          <w:rFonts w:ascii="Times New Roman" w:hAnsi="Times New Roman" w:cs="Times New Roman"/>
+        </w:rPr>
+      </w:pPr>
+      <w:r>
+        <w:rPr>
+          <w:rFonts w:ascii="Times New Roman" w:hAnsi="Times New Roman" w:cs="Times New Roman"/>
+        </w:rPr>
+        <w:t xml:space="preserve"> </w:t>
+      </w:r>
+      <w:r>
+        <w:rPr>
+          <w:rFonts w:ascii="Times New Roman" w:hAnsi="Times New Roman" w:cs="Times New Roman"/>
+          <w:noProof/>
+        </w:rPr>
+        <w:drawing>
+          <wp:inline distT="0" distB="0" distL="0" distR="0" wp14:anchorId="7F215C1F" wp14:editId="731BB017">
+            <wp:extent cx="2725845" cy="2044382"/>
+            <wp:effectExtent l="0" t="0" r="0" b="0"/>
+            <wp:docPr id="482204433" name="Picture 1"/>
+            <wp:cNvGraphicFramePr>
+              <a:graphicFrameLocks xmlns:a="http://schemas.openxmlformats.org/drawingml/2006/main" noChangeAspect="1"/>
+            </wp:cNvGraphicFramePr>
+            <a:graphic xmlns:a="http://schemas.openxmlformats.org/drawingml/2006/main">
+              <a:graphicData uri="http://schemas.openxmlformats.org/drawingml/2006/picture">
+                <pic:pic xmlns:pic="http://schemas.openxmlformats.org/drawingml/2006/picture">
+                  <pic:nvPicPr>
+                    <pic:cNvPr id="482204433" name="Picture 482204433"/>
+                    <pic:cNvPicPr/>
+                  </pic:nvPicPr>
+                  <pic:blipFill>
+                    <a:blip r:embed="rId11">
+                      <a:extLst>
+                        <a:ext uri="{28A0092B-C50C-407E-A947-70E740481C1C}">
+                          <a14:useLocalDpi xmlns:a14="http://schemas.microsoft.com/office/drawing/2010/main" val="0"/>
+                        </a:ext>
+                      </a:extLst>
+                    </a:blip>
+                    <a:stretch>
+                      <a:fillRect/>
+                    </a:stretch>
+                  </pic:blipFill>
+                  <pic:spPr>
+                    <a:xfrm>
+                      <a:off x="0" y="0"/>
+                      <a:ext cx="2767343" cy="2075506"/>
+                    </a:xfrm>
+                    <a:prstGeom prst="rect">
+                      <a:avLst/>
+                    </a:prstGeom>
+                  </pic:spPr>
+                </pic:pic>
+              </a:graphicData>
+            </a:graphic>
+          </wp:inline>
+        </w:drawing>
+      </w:r>
+      <w:r>
+        <w:rPr>
+          <w:rFonts w:ascii="Times New Roman" w:hAnsi="Times New Roman" w:cs="Times New Roman"/>
+          <w:noProof/>
+        </w:rPr>
+        <w:drawing>
+          <wp:inline distT="0" distB="0" distL="0" distR="0" wp14:anchorId="715ED8ED" wp14:editId="39FA5B40">
+            <wp:extent cx="2706794" cy="2030095"/>
+            <wp:effectExtent l="0" t="0" r="0" b="8255"/>
+            <wp:docPr id="1070589335" name="Picture 2"/>
+            <wp:cNvGraphicFramePr>
+              <a:graphicFrameLocks xmlns:a="http://schemas.openxmlformats.org/drawingml/2006/main" noChangeAspect="1"/>
+            </wp:cNvGraphicFramePr>
+            <a:graphic xmlns:a="http://schemas.openxmlformats.org/drawingml/2006/main">
+              <a:graphicData uri="http://schemas.openxmlformats.org/drawingml/2006/picture">
+                <pic:pic xmlns:pic="http://schemas.openxmlformats.org/drawingml/2006/picture">
+                  <pic:nvPicPr>
+                    <pic:cNvPr id="1070589335" name="Picture 1070589335"/>
+                    <pic:cNvPicPr/>
+                  </pic:nvPicPr>
+                  <pic:blipFill>
+                    <a:blip r:embed="rId12">
+                      <a:extLst>
+                        <a:ext uri="{28A0092B-C50C-407E-A947-70E740481C1C}">
+                          <a14:useLocalDpi xmlns:a14="http://schemas.microsoft.com/office/drawing/2010/main" val="0"/>
+                        </a:ext>
+                      </a:extLst>
+                    </a:blip>
+                    <a:stretch>
+                      <a:fillRect/>
+                    </a:stretch>
+                  </pic:blipFill>
+                  <pic:spPr>
+                    <a:xfrm>
+                      <a:off x="0" y="0"/>
+                      <a:ext cx="2749475" cy="2062106"/>
+                    </a:xfrm>
+                    <a:prstGeom prst="rect">
+                      <a:avLst/>
+                    </a:prstGeom>
+                  </pic:spPr>
+                </pic:pic>
+              </a:graphicData>
+            </a:graphic>
+          </wp:inline>
+        </w:drawing>
+      </w:r>
+      <w:r>
+        <w:rPr>
+          <w:rFonts w:ascii="Times New Roman" w:hAnsi="Times New Roman" w:cs="Times New Roman"/>
+        </w:rPr>
+        <w:tab/>
+      </w:r>
+    </w:p>
+    <w:p>
+      <w:pPr>
+        <w:pStyle w:val="ListParagraph"/>
+        <w:tabs>
+          <w:tab w:val="right" w:pos="9360"/>
+        </w:tabs>
+        <w:rPr>
+          <w:rFonts w:ascii="Times New Roman" w:hAnsi="Times New Roman" w:cs="Times New Roman"/>
+        </w:rPr>
+      </w:pPr>
+      <w:r>
+        <w:rPr>
+          <w:rFonts w:ascii="Times New Roman" w:hAnsi="Times New Roman" w:cs="Times New Roman"/>
+        </w:rPr>
+        <w:t xml:space="preserve">These graphs show a healthy amount of change in the times taken to run the number of lines read in. In both cases tests with 16 threads </w:t>
+      </w:r>
+      <w:r>
+        <w:rPr>
+          <w:rFonts w:ascii="Times New Roman" w:hAnsi="Times New Roman" w:cs="Times New Roman"/>
+        </w:rPr>
+        <w:t>were</w:t>
+      </w:r>
+      <w:r>
+        <w:rPr>
+          <w:rFonts w:ascii="Times New Roman" w:hAnsi="Times New Roman" w:cs="Times New Roman"/>
+        </w:rPr>
+        <w:t xml:space="preserve"> attempted to be run but unfortunately was not a configuration. The graph on the left is missing </w:t>
       </w:r>
       <w:proofErr w:type="gramStart"/>
       <w:r>
         <w:rPr>
           <w:rFonts w:ascii="Times New Roman" w:hAnsi="Times New Roman" w:cs="Times New Roman"/>
         </w:rPr>
-        <w:t>amount</w:t>
+        <w:t>thread</w:t>
       </w:r>
       <w:proofErr w:type="gramEnd"/>
       <w:r>
         <w:rPr>
           <w:rFonts w:ascii="Times New Roman" w:hAnsi="Times New Roman" w:cs="Times New Roman"/>
         </w:rPr>
+        <w:t xml:space="preserve"> count</w:t>
+      </w:r>
+      <w:r>
+        <w:rPr>
+          <w:rFonts w:ascii="Times New Roman" w:hAnsi="Times New Roman" w:cs="Times New Roman"/>
+        </w:rPr>
+        <w:t xml:space="preserve"> 1. This is because </w:t>
+      </w:r>
+      <w:r>
+        <w:rPr>
+          <w:rFonts w:ascii="Times New Roman" w:hAnsi="Times New Roman" w:cs="Times New Roman"/>
+        </w:rPr>
+        <w:t>through</w:t>
+      </w:r>
+      <w:r>
+        <w:rPr>
+          <w:rFonts w:ascii="Times New Roman" w:hAnsi="Times New Roman" w:cs="Times New Roman"/>
+        </w:rPr>
+        <w:t xml:space="preserve"> this process if the number of nodes used was greater than the </w:t>
+      </w:r>
+      <w:r>
+        <w:rPr>
+          <w:rFonts w:ascii="Times New Roman" w:hAnsi="Times New Roman" w:cs="Times New Roman"/>
+        </w:rPr>
+        <w:t xml:space="preserve">number of threads the test was unable to run. This is more than likely due to not being able to split 1 thread into half </w:t>
+      </w:r>
+      <w:r>
+        <w:rPr>
+          <w:rFonts w:ascii="Times New Roman" w:hAnsi="Times New Roman" w:cs="Times New Roman"/>
+        </w:rPr>
+        <w:t>thread</w:t>
+      </w:r>
+      <w:r>
+        <w:rPr>
+          <w:rFonts w:ascii="Times New Roman" w:hAnsi="Times New Roman" w:cs="Times New Roman"/>
+        </w:rPr>
+        <w:t xml:space="preserve"> and so on with other tests not being able to split the data or between the nodes </w:t>
+      </w:r>
+      <w:r>
+        <w:rPr>
+          <w:rFonts w:ascii="Times New Roman" w:hAnsi="Times New Roman" w:cs="Times New Roman"/>
+        </w:rPr>
+        <w:t>evenly</w:t>
+      </w:r>
+      <w:r>
+        <w:rPr>
+          <w:rFonts w:ascii="Times New Roman" w:hAnsi="Times New Roman" w:cs="Times New Roman"/>
+        </w:rPr>
+        <w:t xml:space="preserve">. Another difference is the upward trend started at 1 thread on the graph on the right. This could </w:t>
+      </w:r>
+      <w:r>
+        <w:rPr>
+          <w:rFonts w:ascii="Times New Roman" w:hAnsi="Times New Roman" w:cs="Times New Roman"/>
+        </w:rPr>
+        <w:t>possibly be</w:t>
+      </w:r>
+      <w:r>
+        <w:rPr>
+          <w:rFonts w:ascii="Times New Roman" w:hAnsi="Times New Roman" w:cs="Times New Roman"/>
+        </w:rPr>
+        <w:t xml:space="preserve"> due to more jobs being r</w:t>
+      </w:r>
+      <w:r>
+        <w:rPr>
+          <w:rFonts w:ascii="Times New Roman" w:hAnsi="Times New Roman" w:cs="Times New Roman"/>
+        </w:rPr>
+        <w:t>u</w:t>
+      </w:r>
+      <w:r>
+        <w:rPr>
+          <w:rFonts w:ascii="Times New Roman" w:hAnsi="Times New Roman" w:cs="Times New Roman"/>
+        </w:rPr>
+        <w:t>n at the time these tests were done.</w:t>
+      </w:r>
+    </w:p>
+    <w:p>
+      <w:pPr>
+        <w:pStyle w:val="ListParagraph"/>
+        <w:tabs>
+          <w:tab w:val="right" w:pos="9360"/>
+        </w:tabs>
+        <w:rPr>
+          <w:rFonts w:ascii="Times New Roman" w:hAnsi="Times New Roman" w:cs="Times New Roman"/>
+        </w:rPr>
+      </w:pPr>
+      <w:r>
+        <w:rPr>
+          <w:rFonts w:ascii="Times New Roman" w:hAnsi="Times New Roman" w:cs="Times New Roman"/>
+        </w:rPr>
+        <w:tab/>
+      </w:r>
+      <w:r>
+        <w:rPr>
+          <w:rFonts w:ascii="Times New Roman" w:hAnsi="Times New Roman" w:cs="Times New Roman"/>
+        </w:rPr>
+        <w:t xml:space="preserve">The next text was the memory test. The main problem with this one is the same as we saw in </w:t>
+      </w:r>
+      <w:proofErr w:type="spellStart"/>
+      <w:r>
+        <w:rPr>
+          <w:rFonts w:ascii="Times New Roman" w:hAnsi="Times New Roman" w:cs="Times New Roman"/>
+        </w:rPr>
+        <w:t>pthreads</w:t>
+      </w:r>
+      <w:proofErr w:type="spellEnd"/>
+      <w:r>
+        <w:rPr>
+          <w:rFonts w:ascii="Times New Roman" w:hAnsi="Times New Roman" w:cs="Times New Roman"/>
+        </w:rPr>
+        <w:t xml:space="preserve">. That being that there was not enough memory available to spread across the threads and the nodes selected </w:t>
+      </w:r>
+      <w:r>
+        <w:rPr>
+          <w:rFonts w:ascii="Times New Roman" w:hAnsi="Times New Roman" w:cs="Times New Roman"/>
+        </w:rPr>
+        <w:t>for</w:t>
+      </w:r>
+      <w:r>
+        <w:rPr>
+          <w:rFonts w:ascii="Times New Roman" w:hAnsi="Times New Roman" w:cs="Times New Roman"/>
+        </w:rPr>
+        <w:t xml:space="preserve"> </w:t>
+      </w:r>
+      <w:r>
+        <w:rPr>
+          <w:rFonts w:ascii="Times New Roman" w:hAnsi="Times New Roman" w:cs="Times New Roman"/>
+        </w:rPr>
+        <w:t>these tests</w:t>
+      </w:r>
+      <w:r>
+        <w:rPr>
+          <w:rFonts w:ascii="Times New Roman" w:hAnsi="Times New Roman" w:cs="Times New Roman"/>
+        </w:rPr>
+        <w:t xml:space="preserve">. The results are in the graphs below. </w:t>
+      </w:r>
+    </w:p>
+    <w:p>
+      <w:pPr>
+        <w:pStyle w:val="ListParagraph"/>
+        <w:tabs>
+          <w:tab w:val="right" w:pos="9360"/>
+        </w:tabs>
+        <w:rPr>
+          <w:rFonts w:ascii="Times New Roman" w:hAnsi="Times New Roman" w:cs="Times New Roman"/>
+        </w:rPr>
+      </w:pPr>
+      <w:r>
+        <w:rPr>
+          <w:rFonts w:ascii="Times New Roman" w:hAnsi="Times New Roman" w:cs="Times New Roman"/>
+          <w:noProof/>
+        </w:rPr>
+        <w:lastRenderedPageBreak/>
+        <w:drawing>
+          <wp:inline distT="0" distB="0" distL="0" distR="0" wp14:anchorId="68A35D30" wp14:editId="05976826">
+            <wp:extent cx="2727960" cy="2045971"/>
+            <wp:effectExtent l="0" t="0" r="0" b="0"/>
+            <wp:docPr id="157116037" name="Picture 3"/>
+            <wp:cNvGraphicFramePr>
+              <a:graphicFrameLocks xmlns:a="http://schemas.openxmlformats.org/drawingml/2006/main" noChangeAspect="1"/>
+            </wp:cNvGraphicFramePr>
+            <a:graphic xmlns:a="http://schemas.openxmlformats.org/drawingml/2006/main">
+              <a:graphicData uri="http://schemas.openxmlformats.org/drawingml/2006/picture">
+                <pic:pic xmlns:pic="http://schemas.openxmlformats.org/drawingml/2006/picture">
+                  <pic:nvPicPr>
+                    <pic:cNvPr id="157116037" name="Picture 157116037"/>
+                    <pic:cNvPicPr/>
+                  </pic:nvPicPr>
+                  <pic:blipFill>
+                    <a:blip r:embed="rId13">
+                      <a:extLst>
+                        <a:ext uri="{28A0092B-C50C-407E-A947-70E740481C1C}">
+                          <a14:useLocalDpi xmlns:a14="http://schemas.microsoft.com/office/drawing/2010/main" val="0"/>
+                        </a:ext>
+                      </a:extLst>
+                    </a:blip>
+                    <a:stretch>
+                      <a:fillRect/>
+                    </a:stretch>
+                  </pic:blipFill>
+                  <pic:spPr>
+                    <a:xfrm>
+                      <a:off x="0" y="0"/>
+                      <a:ext cx="2737575" cy="2053182"/>
+                    </a:xfrm>
+                    <a:prstGeom prst="rect">
+                      <a:avLst/>
+                    </a:prstGeom>
+                  </pic:spPr>
+                </pic:pic>
+              </a:graphicData>
+            </a:graphic>
+          </wp:inline>
+        </w:drawing>
+      </w:r>
+      <w:r>
+        <w:rPr>
+          <w:rFonts w:ascii="Times New Roman" w:hAnsi="Times New Roman" w:cs="Times New Roman"/>
+          <w:noProof/>
+        </w:rPr>
+        <w:drawing>
+          <wp:inline distT="0" distB="0" distL="0" distR="0" wp14:anchorId="607A7EAC" wp14:editId="68E15831">
+            <wp:extent cx="2726055" cy="2044542"/>
+            <wp:effectExtent l="0" t="0" r="0" b="0"/>
+            <wp:docPr id="1764716463" name="Picture 5"/>
+            <wp:cNvGraphicFramePr>
+              <a:graphicFrameLocks xmlns:a="http://schemas.openxmlformats.org/drawingml/2006/main" noChangeAspect="1"/>
+            </wp:cNvGraphicFramePr>
+            <a:graphic xmlns:a="http://schemas.openxmlformats.org/drawingml/2006/main">
+              <a:graphicData uri="http://schemas.openxmlformats.org/drawingml/2006/picture">
+                <pic:pic xmlns:pic="http://schemas.openxmlformats.org/drawingml/2006/picture">
+                  <pic:nvPicPr>
+                    <pic:cNvPr id="1764716463" name="Picture 1764716463"/>
+                    <pic:cNvPicPr/>
+                  </pic:nvPicPr>
+                  <pic:blipFill>
+                    <a:blip r:embed="rId14">
+                      <a:extLst>
+                        <a:ext uri="{28A0092B-C50C-407E-A947-70E740481C1C}">
+                          <a14:useLocalDpi xmlns:a14="http://schemas.microsoft.com/office/drawing/2010/main" val="0"/>
+                        </a:ext>
+                      </a:extLst>
+                    </a:blip>
+                    <a:stretch>
+                      <a:fillRect/>
+                    </a:stretch>
+                  </pic:blipFill>
+                  <pic:spPr>
+                    <a:xfrm>
+                      <a:off x="0" y="0"/>
+                      <a:ext cx="2762734" cy="2072051"/>
+                    </a:xfrm>
+                    <a:prstGeom prst="rect">
+                      <a:avLst/>
+                    </a:prstGeom>
+                  </pic:spPr>
+                </pic:pic>
+              </a:graphicData>
+            </a:graphic>
+          </wp:inline>
+        </w:drawing>
+      </w:r>
+    </w:p>
+    <w:p>
+      <w:pPr>
+        <w:pStyle w:val="ListParagraph"/>
+        <w:tabs>
+          <w:tab w:val="right" w:pos="9360"/>
+        </w:tabs>
+        <w:rPr>
+          <w:rFonts w:ascii="Times New Roman" w:hAnsi="Times New Roman" w:cs="Times New Roman"/>
+        </w:rPr>
+      </w:pPr>
+      <w:r>
+        <w:rPr>
+          <w:rFonts w:ascii="Times New Roman" w:hAnsi="Times New Roman" w:cs="Times New Roman"/>
+        </w:rPr>
+        <w:t>One test was r</w:t>
+      </w:r>
+      <w:r>
+        <w:rPr>
+          <w:rFonts w:ascii="Times New Roman" w:hAnsi="Times New Roman" w:cs="Times New Roman"/>
+        </w:rPr>
+        <w:t>u</w:t>
+      </w:r>
+      <w:r>
+        <w:rPr>
+          <w:rFonts w:ascii="Times New Roman" w:hAnsi="Times New Roman" w:cs="Times New Roman"/>
+        </w:rPr>
+        <w:t xml:space="preserve">n with 8 threads, read 100 thousand </w:t>
+      </w:r>
+      <w:r>
+        <w:rPr>
+          <w:rFonts w:ascii="Times New Roman" w:hAnsi="Times New Roman" w:cs="Times New Roman"/>
+        </w:rPr>
+        <w:t>lines</w:t>
+      </w:r>
+      <w:r>
+        <w:rPr>
+          <w:rFonts w:ascii="Times New Roman" w:hAnsi="Times New Roman" w:cs="Times New Roman"/>
+        </w:rPr>
+        <w:t xml:space="preserve"> with 2 nodes, while the other was ran with 4 threads, read 10 thousand lines also on 2 nodes. Like the number of </w:t>
+      </w:r>
+      <w:r>
+        <w:rPr>
+          <w:rFonts w:ascii="Times New Roman" w:hAnsi="Times New Roman" w:cs="Times New Roman"/>
+        </w:rPr>
+        <w:t>threads,</w:t>
+      </w:r>
+      <w:r>
+        <w:rPr>
+          <w:rFonts w:ascii="Times New Roman" w:hAnsi="Times New Roman" w:cs="Times New Roman"/>
+        </w:rPr>
+        <w:t xml:space="preserve"> the graph on the left is missing 64MB and 128MB because there was not enough memory to perform the test with those parameters. </w:t>
+      </w:r>
+      <w:r>
+        <w:rPr>
+          <w:rFonts w:ascii="Times New Roman" w:hAnsi="Times New Roman" w:cs="Times New Roman"/>
+        </w:rPr>
+        <w:t xml:space="preserve">The graphs are </w:t>
+      </w:r>
+      <w:r>
+        <w:rPr>
+          <w:rFonts w:ascii="Times New Roman" w:hAnsi="Times New Roman" w:cs="Times New Roman"/>
+        </w:rPr>
+        <w:t>sporadic</w:t>
+      </w:r>
+      <w:r>
+        <w:rPr>
+          <w:rFonts w:ascii="Times New Roman" w:hAnsi="Times New Roman" w:cs="Times New Roman"/>
+        </w:rPr>
+        <w:t xml:space="preserve"> jumping around between test points. This is probably due to noise or an increase in the jobs being submitted when these tests were being r</w:t>
+      </w:r>
+      <w:r>
+        <w:rPr>
+          <w:rFonts w:ascii="Times New Roman" w:hAnsi="Times New Roman" w:cs="Times New Roman"/>
+        </w:rPr>
+        <w:t>u</w:t>
+      </w:r>
+      <w:r>
+        <w:rPr>
+          <w:rFonts w:ascii="Times New Roman" w:hAnsi="Times New Roman" w:cs="Times New Roman"/>
+        </w:rPr>
+        <w:t xml:space="preserve">n. Now let us examine the last test that was some between </w:t>
+      </w:r>
+      <w:proofErr w:type="spellStart"/>
+      <w:r>
+        <w:rPr>
+          <w:rFonts w:ascii="Times New Roman" w:hAnsi="Times New Roman" w:cs="Times New Roman"/>
+        </w:rPr>
+        <w:t>pthreads</w:t>
+      </w:r>
+      <w:proofErr w:type="spellEnd"/>
+      <w:r>
+        <w:rPr>
+          <w:rFonts w:ascii="Times New Roman" w:hAnsi="Times New Roman" w:cs="Times New Roman"/>
+        </w:rPr>
+        <w:t xml:space="preserve"> and MPI.</w:t>
+      </w:r>
+    </w:p>
+    <w:p>
+      <w:pPr>
+        <w:pStyle w:val="ListParagraph"/>
+        <w:tabs>
+          <w:tab w:val="right" w:pos="9360"/>
+        </w:tabs>
+        <w:rPr>
+          <w:rFonts w:ascii="Times New Roman" w:hAnsi="Times New Roman" w:cs="Times New Roman"/>
+        </w:rPr>
+      </w:pPr>
+      <w:r>
+        <w:rPr>
+          <w:rFonts w:ascii="Times New Roman" w:hAnsi="Times New Roman" w:cs="Times New Roman"/>
+        </w:rPr>
+        <w:tab/>
+        <w:t>Next</w:t>
+      </w:r>
+      <w:r>
+        <w:rPr>
+          <w:rFonts w:ascii="Times New Roman" w:hAnsi="Times New Roman" w:cs="Times New Roman"/>
+        </w:rPr>
+        <w:t>,</w:t>
+      </w:r>
+      <w:r>
+        <w:rPr>
+          <w:rFonts w:ascii="Times New Roman" w:hAnsi="Times New Roman" w:cs="Times New Roman"/>
+        </w:rPr>
+        <w:t xml:space="preserve"> we examine how </w:t>
+      </w:r>
+      <w:r>
+        <w:rPr>
+          <w:rFonts w:ascii="Times New Roman" w:hAnsi="Times New Roman" w:cs="Times New Roman"/>
+        </w:rPr>
+        <w:t>the</w:t>
+      </w:r>
+      <w:r>
+        <w:rPr>
+          <w:rFonts w:ascii="Times New Roman" w:hAnsi="Times New Roman" w:cs="Times New Roman"/>
+        </w:rPr>
+        <w:t xml:space="preserve"> number of lines read affects the time it takes to process using MPI. The results are below. We ran tests with 2 threads, 512MB of data and 2 nodes and one with 8 threads, 1GB of data, and 2 nodes.</w:t>
+      </w:r>
+    </w:p>
+    <w:p>
+      <w:pPr>
+        <w:pStyle w:val="ListParagraph"/>
+        <w:tabs>
+          <w:tab w:val="right" w:pos="9360"/>
+        </w:tabs>
+        <w:rPr>
+          <w:rFonts w:ascii="Times New Roman" w:hAnsi="Times New Roman" w:cs="Times New Roman"/>
+        </w:rPr>
+      </w:pPr>
+      <w:r>
+        <w:rPr>
+          <w:rFonts w:ascii="Times New Roman" w:hAnsi="Times New Roman" w:cs="Times New Roman"/>
+          <w:noProof/>
+        </w:rPr>
+        <w:drawing>
+          <wp:inline distT="0" distB="0" distL="0" distR="0" wp14:anchorId="3D95FCA7" wp14:editId="278B9BBF">
+            <wp:extent cx="2720623" cy="2040467"/>
+            <wp:effectExtent l="0" t="0" r="3810" b="0"/>
+            <wp:docPr id="1957053597" name="Picture 6"/>
+            <wp:cNvGraphicFramePr>
+              <a:graphicFrameLocks xmlns:a="http://schemas.openxmlformats.org/drawingml/2006/main" noChangeAspect="1"/>
+            </wp:cNvGraphicFramePr>
+            <a:graphic xmlns:a="http://schemas.openxmlformats.org/drawingml/2006/main">
+              <a:graphicData uri="http://schemas.openxmlformats.org/drawingml/2006/picture">
+                <pic:pic xmlns:pic="http://schemas.openxmlformats.org/drawingml/2006/picture">
+                  <pic:nvPicPr>
+                    <pic:cNvPr id="1957053597" name="Picture 1957053597"/>
+                    <pic:cNvPicPr/>
+                  </pic:nvPicPr>
+                  <pic:blipFill>
+                    <a:blip r:embed="rId15">
+                      <a:extLst>
+                        <a:ext uri="{28A0092B-C50C-407E-A947-70E740481C1C}">
+                          <a14:useLocalDpi xmlns:a14="http://schemas.microsoft.com/office/drawing/2010/main" val="0"/>
+                        </a:ext>
+                      </a:extLst>
+                    </a:blip>
+                    <a:stretch>
+                      <a:fillRect/>
+                    </a:stretch>
+                  </pic:blipFill>
+                  <pic:spPr>
+                    <a:xfrm>
+                      <a:off x="0" y="0"/>
+                      <a:ext cx="2736958" cy="2052718"/>
+                    </a:xfrm>
+                    <a:prstGeom prst="rect">
+                      <a:avLst/>
+                    </a:prstGeom>
+                  </pic:spPr>
+                </pic:pic>
+              </a:graphicData>
+            </a:graphic>
+          </wp:inline>
+        </w:drawing>
+      </w:r>
+      <w:r>
+        <w:rPr>
+          <w:rFonts w:ascii="Times New Roman" w:hAnsi="Times New Roman" w:cs="Times New Roman"/>
+          <w:noProof/>
+        </w:rPr>
+        <w:drawing>
+          <wp:inline distT="0" distB="0" distL="0" distR="0" wp14:anchorId="04041163" wp14:editId="6D79DDB9">
+            <wp:extent cx="2726266" cy="2044699"/>
+            <wp:effectExtent l="0" t="0" r="0" b="0"/>
+            <wp:docPr id="1386556684" name="Picture 7"/>
+            <wp:cNvGraphicFramePr>
+              <a:graphicFrameLocks xmlns:a="http://schemas.openxmlformats.org/drawingml/2006/main" noChangeAspect="1"/>
+            </wp:cNvGraphicFramePr>
+            <a:graphic xmlns:a="http://schemas.openxmlformats.org/drawingml/2006/main">
+              <a:graphicData uri="http://schemas.openxmlformats.org/drawingml/2006/picture">
+                <pic:pic xmlns:pic="http://schemas.openxmlformats.org/drawingml/2006/picture">
+                  <pic:nvPicPr>
+                    <pic:cNvPr id="1386556684" name="Picture 1386556684"/>
+                    <pic:cNvPicPr/>
+                  </pic:nvPicPr>
+                  <pic:blipFill>
+                    <a:blip r:embed="rId16">
+                      <a:extLst>
+                        <a:ext uri="{28A0092B-C50C-407E-A947-70E740481C1C}">
+                          <a14:useLocalDpi xmlns:a14="http://schemas.microsoft.com/office/drawing/2010/main" val="0"/>
+                        </a:ext>
+                      </a:extLst>
+                    </a:blip>
+                    <a:stretch>
+                      <a:fillRect/>
+                    </a:stretch>
+                  </pic:blipFill>
+                  <pic:spPr>
+                    <a:xfrm>
+                      <a:off x="0" y="0"/>
+                      <a:ext cx="2755534" cy="2066650"/>
+                    </a:xfrm>
+                    <a:prstGeom prst="rect">
+                      <a:avLst/>
+                    </a:prstGeom>
+                  </pic:spPr>
+                </pic:pic>
+              </a:graphicData>
+            </a:graphic>
+          </wp:inline>
+        </w:drawing>
+      </w:r>
+    </w:p>
+    <w:p>
+      <w:pPr>
+        <w:pStyle w:val="ListParagraph"/>
+        <w:tabs>
+          <w:tab w:val="right" w:pos="9360"/>
+        </w:tabs>
+        <w:rPr>
+          <w:rFonts w:ascii="Times New Roman" w:hAnsi="Times New Roman" w:cs="Times New Roman"/>
+        </w:rPr>
+      </w:pPr>
+      <w:r>
+        <w:rPr>
+          <w:rFonts w:ascii="Times New Roman" w:hAnsi="Times New Roman" w:cs="Times New Roman"/>
+        </w:rPr>
+        <w:t>These two tests</w:t>
+      </w:r>
+      <w:r>
+        <w:rPr>
+          <w:rFonts w:ascii="Times New Roman" w:hAnsi="Times New Roman" w:cs="Times New Roman"/>
+        </w:rPr>
+        <w:t xml:space="preserve"> ran very </w:t>
+      </w:r>
+      <w:r>
+        <w:rPr>
+          <w:rFonts w:ascii="Times New Roman" w:hAnsi="Times New Roman" w:cs="Times New Roman"/>
+        </w:rPr>
+        <w:t>similarly</w:t>
+      </w:r>
+      <w:r>
+        <w:rPr>
+          <w:rFonts w:ascii="Times New Roman" w:hAnsi="Times New Roman" w:cs="Times New Roman"/>
+        </w:rPr>
+        <w:t xml:space="preserve">. When you add more lines to be read the time increases.  The tests using 2 threads </w:t>
+      </w:r>
+      <w:r>
+        <w:rPr>
+          <w:rFonts w:ascii="Times New Roman" w:hAnsi="Times New Roman" w:cs="Times New Roman"/>
+        </w:rPr>
+        <w:t>overall</w:t>
+      </w:r>
+      <w:r>
+        <w:rPr>
+          <w:rFonts w:ascii="Times New Roman" w:hAnsi="Times New Roman" w:cs="Times New Roman"/>
+        </w:rPr>
+        <w:t xml:space="preserve"> were </w:t>
+      </w:r>
+      <w:r>
+        <w:rPr>
+          <w:rFonts w:ascii="Times New Roman" w:hAnsi="Times New Roman" w:cs="Times New Roman"/>
+        </w:rPr>
+        <w:t>fewer</w:t>
+      </w:r>
+      <w:r>
+        <w:rPr>
+          <w:rFonts w:ascii="Times New Roman" w:hAnsi="Times New Roman" w:cs="Times New Roman"/>
+        </w:rPr>
+        <w:t xml:space="preserve"> because there did not need to be as many resources split </w:t>
+      </w:r>
+      <w:r>
+        <w:rPr>
+          <w:rFonts w:ascii="Times New Roman" w:hAnsi="Times New Roman" w:cs="Times New Roman"/>
+        </w:rPr>
+        <w:t>to</w:t>
+      </w:r>
+      <w:r>
+        <w:rPr>
+          <w:rFonts w:ascii="Times New Roman" w:hAnsi="Times New Roman" w:cs="Times New Roman"/>
+        </w:rPr>
+        <w:t xml:space="preserve"> complete the task. The test with 1 million lines in both cases there was not enough memory to process the </w:t>
+      </w:r>
+      <w:r>
+        <w:rPr>
+          <w:rFonts w:ascii="Times New Roman" w:hAnsi="Times New Roman" w:cs="Times New Roman"/>
+        </w:rPr>
+        <w:t>number</w:t>
+      </w:r>
+      <w:r>
+        <w:rPr>
+          <w:rFonts w:ascii="Times New Roman" w:hAnsi="Times New Roman" w:cs="Times New Roman"/>
+        </w:rPr>
+        <w:t xml:space="preserve"> of lines that were being asked.</w:t>
+      </w:r>
+    </w:p>
+    <w:p>
+      <w:pPr>
+        <w:pStyle w:val="ListParagraph"/>
+        <w:tabs>
+          <w:tab w:val="right" w:pos="9360"/>
+        </w:tabs>
+        <w:rPr>
+          <w:rFonts w:ascii="Times New Roman" w:hAnsi="Times New Roman" w:cs="Times New Roman"/>
+        </w:rPr>
+      </w:pPr>
+      <w:r>
+        <w:rPr>
+          <w:rFonts w:ascii="Times New Roman" w:hAnsi="Times New Roman" w:cs="Times New Roman"/>
+        </w:rPr>
+        <w:tab/>
+      </w:r>
+      <w:r>
+        <w:rPr>
+          <w:rFonts w:ascii="Times New Roman" w:hAnsi="Times New Roman" w:cs="Times New Roman"/>
+        </w:rPr>
+        <w:t xml:space="preserve">The last test we ran only </w:t>
+      </w:r>
+      <w:r>
+        <w:rPr>
+          <w:rFonts w:ascii="Times New Roman" w:hAnsi="Times New Roman" w:cs="Times New Roman"/>
+        </w:rPr>
+        <w:t>applied</w:t>
+      </w:r>
+      <w:r>
+        <w:rPr>
+          <w:rFonts w:ascii="Times New Roman" w:hAnsi="Times New Roman" w:cs="Times New Roman"/>
+        </w:rPr>
+        <w:t xml:space="preserve"> to MPI as that is the only one we can change how many machines the tests are run on </w:t>
+      </w:r>
+      <w:r>
+        <w:rPr>
+          <w:rFonts w:ascii="Times New Roman" w:hAnsi="Times New Roman" w:cs="Times New Roman"/>
+        </w:rPr>
+        <w:t>to</w:t>
+      </w:r>
+      <w:r>
+        <w:rPr>
+          <w:rFonts w:ascii="Times New Roman" w:hAnsi="Times New Roman" w:cs="Times New Roman"/>
+        </w:rPr>
+        <w:t xml:space="preserve"> split up the work. </w:t>
+      </w:r>
+    </w:p>
+    <w:p>
+      <w:pPr>
+        <w:pStyle w:val="ListParagraph"/>
+        <w:tabs>
+          <w:tab w:val="right" w:pos="9360"/>
+        </w:tabs>
+        <w:rPr>
+          <w:rFonts w:ascii="Times New Roman" w:hAnsi="Times New Roman" w:cs="Times New Roman"/>
+        </w:rPr>
+      </w:pPr>
+      <w:r>
+        <w:rPr>
+          <w:rFonts w:ascii="Times New Roman" w:hAnsi="Times New Roman" w:cs="Times New Roman"/>
+          <w:noProof/>
+        </w:rPr>
+        <w:lastRenderedPageBreak/>
+        <w:drawing>
+          <wp:inline distT="0" distB="0" distL="0" distR="0" wp14:anchorId="22295834" wp14:editId="19BDFDF3">
+            <wp:extent cx="2679134" cy="2009351"/>
+            <wp:effectExtent l="0" t="0" r="6985" b="0"/>
+            <wp:docPr id="1696288575" name="Picture 10"/>
+            <wp:cNvGraphicFramePr>
+              <a:graphicFrameLocks xmlns:a="http://schemas.openxmlformats.org/drawingml/2006/main" noChangeAspect="1"/>
+            </wp:cNvGraphicFramePr>
+            <a:graphic xmlns:a="http://schemas.openxmlformats.org/drawingml/2006/main">
+              <a:graphicData uri="http://schemas.openxmlformats.org/drawingml/2006/picture">
+                <pic:pic xmlns:pic="http://schemas.openxmlformats.org/drawingml/2006/picture">
+                  <pic:nvPicPr>
+                    <pic:cNvPr id="1696288575" name="Picture 1696288575"/>
+                    <pic:cNvPicPr/>
+                  </pic:nvPicPr>
+                  <pic:blipFill>
+                    <a:blip r:embed="rId17">
+                      <a:extLst>
+                        <a:ext uri="{28A0092B-C50C-407E-A947-70E740481C1C}">
+                          <a14:useLocalDpi xmlns:a14="http://schemas.microsoft.com/office/drawing/2010/main" val="0"/>
+                        </a:ext>
+                      </a:extLst>
+                    </a:blip>
+                    <a:stretch>
+                      <a:fillRect/>
+                    </a:stretch>
+                  </pic:blipFill>
+                  <pic:spPr>
+                    <a:xfrm>
+                      <a:off x="0" y="0"/>
+                      <a:ext cx="2696438" cy="2022329"/>
+                    </a:xfrm>
+                    <a:prstGeom prst="rect">
+                      <a:avLst/>
+                    </a:prstGeom>
+                  </pic:spPr>
+                </pic:pic>
+              </a:graphicData>
+            </a:graphic>
+          </wp:inline>
+        </w:drawing>
+      </w:r>
+      <w:r>
+        <w:rPr>
+          <w:rFonts w:ascii="Times New Roman" w:hAnsi="Times New Roman" w:cs="Times New Roman"/>
+          <w:noProof/>
+        </w:rPr>
+        <w:drawing>
+          <wp:inline distT="0" distB="0" distL="0" distR="0" wp14:anchorId="550815C2" wp14:editId="2F2D33FC">
+            <wp:extent cx="2691977" cy="2018983"/>
+            <wp:effectExtent l="0" t="0" r="0" b="635"/>
+            <wp:docPr id="2087881926" name="Picture 11"/>
+            <wp:cNvGraphicFramePr>
+              <a:graphicFrameLocks xmlns:a="http://schemas.openxmlformats.org/drawingml/2006/main" noChangeAspect="1"/>
+            </wp:cNvGraphicFramePr>
+            <a:graphic xmlns:a="http://schemas.openxmlformats.org/drawingml/2006/main">
+              <a:graphicData uri="http://schemas.openxmlformats.org/drawingml/2006/picture">
+                <pic:pic xmlns:pic="http://schemas.openxmlformats.org/drawingml/2006/picture">
+                  <pic:nvPicPr>
+                    <pic:cNvPr id="2087881926" name="Picture 2087881926"/>
+                    <pic:cNvPicPr/>
+                  </pic:nvPicPr>
+                  <pic:blipFill>
+                    <a:blip r:embed="rId18">
+                      <a:extLst>
+                        <a:ext uri="{28A0092B-C50C-407E-A947-70E740481C1C}">
+                          <a14:useLocalDpi xmlns:a14="http://schemas.microsoft.com/office/drawing/2010/main" val="0"/>
+                        </a:ext>
+                      </a:extLst>
+                    </a:blip>
+                    <a:stretch>
+                      <a:fillRect/>
+                    </a:stretch>
+                  </pic:blipFill>
+                  <pic:spPr>
+                    <a:xfrm>
+                      <a:off x="0" y="0"/>
+                      <a:ext cx="2727428" cy="2045571"/>
+                    </a:xfrm>
+                    <a:prstGeom prst="rect">
+                      <a:avLst/>
+                    </a:prstGeom>
+                  </pic:spPr>
+                </pic:pic>
+              </a:graphicData>
+            </a:graphic>
+          </wp:inline>
+        </w:drawing>
+      </w:r>
+    </w:p>
+    <w:p>
+      <w:pPr>
+        <w:pStyle w:val="ListParagraph"/>
+        <w:tabs>
+          <w:tab w:val="right" w:pos="9360"/>
+        </w:tabs>
+        <w:rPr>
+          <w:rFonts w:ascii="Times New Roman" w:hAnsi="Times New Roman" w:cs="Times New Roman"/>
+        </w:rPr>
+      </w:pPr>
+      <w:r>
+        <w:rPr>
+          <w:rFonts w:ascii="Times New Roman" w:hAnsi="Times New Roman" w:cs="Times New Roman"/>
+        </w:rPr>
+        <w:t xml:space="preserve">As seen above we can come to the same conclusion as we did with the threads test. The test on the left only shows one point at node number using 1 thread for all the tests. There is only one point because after the number of nodes excessed the number of nodes there is not a good or even way to split the data. The same can be said about the graph of the right except this time we used 4 </w:t>
+      </w:r>
+      <w:r>
+        <w:rPr>
+          <w:rFonts w:ascii="Times New Roman" w:hAnsi="Times New Roman" w:cs="Times New Roman"/>
+        </w:rPr>
+        <w:t>threads,</w:t>
+      </w:r>
+      <w:r>
+        <w:rPr>
+          <w:rFonts w:ascii="Times New Roman" w:hAnsi="Times New Roman" w:cs="Times New Roman"/>
+        </w:rPr>
+        <w:t xml:space="preserve"> so the tests ran tell the nodes equaled 4 then failed for the remaining node counts.</w:t>
+      </w:r>
+    </w:p>
+    <w:p>
+      <w:pPr>
+        <w:pStyle w:val="ListParagraph"/>
+        <w:tabs>
+          <w:tab w:val="right" w:pos="9360"/>
+        </w:tabs>
+        <w:rPr>
+          <w:rFonts w:ascii="Times New Roman" w:hAnsi="Times New Roman" w:cs="Times New Roman"/>
+        </w:rPr>
+      </w:pPr>
+      <w:r>
+        <w:rPr>
+          <w:rFonts w:ascii="Times New Roman" w:hAnsi="Times New Roman" w:cs="Times New Roman"/>
+        </w:rPr>
+        <w:tab/>
+        <w:t xml:space="preserve">Overall MPI ran slower than </w:t>
+      </w:r>
+      <w:proofErr w:type="spellStart"/>
+      <w:r>
+        <w:rPr>
+          <w:rFonts w:ascii="Times New Roman" w:hAnsi="Times New Roman" w:cs="Times New Roman"/>
+        </w:rPr>
+        <w:t>pthreads</w:t>
+      </w:r>
+      <w:proofErr w:type="spellEnd"/>
+      <w:r>
+        <w:rPr>
+          <w:rFonts w:ascii="Times New Roman" w:hAnsi="Times New Roman" w:cs="Times New Roman"/>
+        </w:rPr>
+        <w:t xml:space="preserve">. This doesn’t necessarily mean it is slower all the time but in this instance it was. The belief of this is that the number of lines read in during </w:t>
+      </w:r>
+      <w:r>
+        <w:rPr>
+          <w:rFonts w:ascii="Times New Roman" w:hAnsi="Times New Roman" w:cs="Times New Roman"/>
+        </w:rPr>
+        <w:t>these tests</w:t>
+      </w:r>
+      <w:r>
+        <w:rPr>
+          <w:rFonts w:ascii="Times New Roman" w:hAnsi="Times New Roman" w:cs="Times New Roman"/>
+        </w:rPr>
+        <w:t xml:space="preserve"> were too small for MPI to make a difference. Because the sharing and splitting of data between nodes </w:t>
+      </w:r>
+      <w:r>
+        <w:rPr>
+          <w:rFonts w:ascii="Times New Roman" w:hAnsi="Times New Roman" w:cs="Times New Roman"/>
+        </w:rPr>
+        <w:t>overhead</w:t>
+      </w:r>
+      <w:r>
+        <w:rPr>
+          <w:rFonts w:ascii="Times New Roman" w:hAnsi="Times New Roman" w:cs="Times New Roman"/>
+        </w:rPr>
+        <w:t xml:space="preserve"> and keeping track of everything transferring it between nodes took longer than just having one node do the all the work as in </w:t>
+      </w:r>
+      <w:proofErr w:type="spellStart"/>
+      <w:r>
+        <w:rPr>
+          <w:rFonts w:ascii="Times New Roman" w:hAnsi="Times New Roman" w:cs="Times New Roman"/>
+        </w:rPr>
+        <w:t>pthreads</w:t>
+      </w:r>
+      <w:proofErr w:type="spellEnd"/>
+      <w:r>
+        <w:rPr>
+          <w:rFonts w:ascii="Times New Roman" w:hAnsi="Times New Roman" w:cs="Times New Roman"/>
+        </w:rPr>
+        <w:t>.</w:t>
+      </w:r>
+    </w:p>
+    <w:p>
+      <w:pPr>
+        <w:pStyle w:val="ListParagraph"/>
+        <w:tabs>
+          <w:tab w:val="right" w:pos="9360"/>
+        </w:tabs>
+        <w:rPr>
+          <w:rFonts w:ascii="Times New Roman" w:hAnsi="Times New Roman" w:cs="Times New Roman"/>
+        </w:rPr>
+      </w:pPr>
+    </w:p>
+    <w:p>
+      <w:pPr>
+        <w:pStyle w:val="ListParagraph"/>
+        <w:numPr>
+          <w:ilvl w:val="0"/>
+          <w:numId w:val="1"/>
+        </w:numPr>
+        <w:tabs>
+          <w:tab w:val="right" w:pos="9360"/>
+        </w:tabs>
+        <w:rPr>
+          <w:rFonts w:ascii="Times New Roman" w:hAnsi="Times New Roman" w:cs="Times New Roman"/>
+        </w:rPr>
+      </w:pPr>
+      <w:r>
+        <w:rPr>
+          <w:rFonts w:ascii="Times New Roman" w:hAnsi="Times New Roman" w:cs="Times New Roman"/>
+        </w:rPr>
+        <w:t>OpenMP</w:t>
+      </w:r>
+    </w:p>
+    <w:p>
+      <w:pPr>
+        <w:pStyle w:val="ListParagraph"/>
+        <w:tabs>
+          <w:tab w:val="right" w:pos="9360"/>
+        </w:tabs>
+        <w:rPr>
+          <w:rFonts w:ascii="Times New Roman" w:hAnsi="Times New Roman" w:cs="Times New Roman"/>
+        </w:rPr>
+      </w:pPr>
+      <w:r>
+        <w:rPr>
+          <w:rFonts w:ascii="Times New Roman" w:hAnsi="Times New Roman" w:cs="Times New Roman"/>
+        </w:rPr>
+        <w:tab/>
+        <w:t xml:space="preserve">OpenMP is the last implementation that was tested. It is a lot like </w:t>
+      </w:r>
+      <w:proofErr w:type="spellStart"/>
+      <w:r>
+        <w:rPr>
+          <w:rFonts w:ascii="Times New Roman" w:hAnsi="Times New Roman" w:cs="Times New Roman"/>
+        </w:rPr>
+        <w:t>pthreads</w:t>
+      </w:r>
+      <w:proofErr w:type="spellEnd"/>
+      <w:r>
+        <w:rPr>
+          <w:rFonts w:ascii="Times New Roman" w:hAnsi="Times New Roman" w:cs="Times New Roman"/>
+        </w:rPr>
+        <w:t xml:space="preserve"> but a bit simpler sharing data between one node but it doesn’t have to manipulate the arrays like the following two implementations did.</w:t>
+      </w:r>
+      <w:r>
+        <w:rPr>
+          <w:rFonts w:ascii="Times New Roman" w:hAnsi="Times New Roman" w:cs="Times New Roman"/>
+        </w:rPr>
+        <w:t xml:space="preserve"> That also means that the number of nodes for </w:t>
+      </w:r>
+      <w:r>
+        <w:rPr>
+          <w:rFonts w:ascii="Times New Roman" w:hAnsi="Times New Roman" w:cs="Times New Roman"/>
+        </w:rPr>
+        <w:t>these tests</w:t>
+      </w:r>
+      <w:r>
+        <w:rPr>
+          <w:rFonts w:ascii="Times New Roman" w:hAnsi="Times New Roman" w:cs="Times New Roman"/>
+        </w:rPr>
+        <w:t xml:space="preserve"> was left at 1 to ensure only 1 machine was used to get the time.</w:t>
+      </w:r>
+      <w:r>
+        <w:rPr>
+          <w:rFonts w:ascii="Times New Roman" w:hAnsi="Times New Roman" w:cs="Times New Roman"/>
+        </w:rPr>
+        <w:t xml:space="preserve"> The </w:t>
+      </w:r>
+      <w:r>
+        <w:rPr>
+          <w:rFonts w:ascii="Times New Roman" w:hAnsi="Times New Roman" w:cs="Times New Roman"/>
+        </w:rPr>
+        <w:t>first</w:t>
+      </w:r>
+      <w:r>
+        <w:rPr>
+          <w:rFonts w:ascii="Times New Roman" w:hAnsi="Times New Roman" w:cs="Times New Roman"/>
+        </w:rPr>
+        <w:t xml:space="preserve"> test was r</w:t>
+      </w:r>
+      <w:r>
+        <w:rPr>
+          <w:rFonts w:ascii="Times New Roman" w:hAnsi="Times New Roman" w:cs="Times New Roman"/>
+        </w:rPr>
+        <w:t>u</w:t>
+      </w:r>
+      <w:r>
+        <w:rPr>
+          <w:rFonts w:ascii="Times New Roman" w:hAnsi="Times New Roman" w:cs="Times New Roman"/>
+        </w:rPr>
+        <w:t xml:space="preserve">n on how the number of CPUs used affected the time it took to scan a certain number of lines. </w:t>
+      </w:r>
+    </w:p>
+    <w:p>
+      <w:pPr>
+        <w:pStyle w:val="ListParagraph"/>
+        <w:tabs>
+          <w:tab w:val="right" w:pos="9360"/>
+        </w:tabs>
+        <w:rPr>
+          <w:rFonts w:ascii="Times New Roman" w:hAnsi="Times New Roman" w:cs="Times New Roman"/>
+        </w:rPr>
+      </w:pPr>
+      <w:r>
+        <w:rPr>
+          <w:rFonts w:ascii="Times New Roman" w:hAnsi="Times New Roman" w:cs="Times New Roman"/>
+          <w:noProof/>
+        </w:rPr>
+        <w:drawing>
+          <wp:inline distT="0" distB="0" distL="0" distR="0" wp14:anchorId="29201F0A" wp14:editId="0A461AA0">
+            <wp:extent cx="2668127" cy="2001096"/>
+            <wp:effectExtent l="0" t="0" r="0" b="0"/>
+            <wp:docPr id="320584980" name="Picture 18"/>
+            <wp:cNvGraphicFramePr>
+              <a:graphicFrameLocks xmlns:a="http://schemas.openxmlformats.org/drawingml/2006/main" noChangeAspect="1"/>
+            </wp:cNvGraphicFramePr>
+            <a:graphic xmlns:a="http://schemas.openxmlformats.org/drawingml/2006/main">
+              <a:graphicData uri="http://schemas.openxmlformats.org/drawingml/2006/picture">
+                <pic:pic xmlns:pic="http://schemas.openxmlformats.org/drawingml/2006/picture">
+                  <pic:nvPicPr>
+                    <pic:cNvPr id="320584980" name="Picture 320584980"/>
+                    <pic:cNvPicPr/>
+                  </pic:nvPicPr>
+                  <pic:blipFill>
+                    <a:blip r:embed="rId19">
+                      <a:extLst>
+                        <a:ext uri="{28A0092B-C50C-407E-A947-70E740481C1C}">
+                          <a14:useLocalDpi xmlns:a14="http://schemas.microsoft.com/office/drawing/2010/main" val="0"/>
+                        </a:ext>
+                      </a:extLst>
+                    </a:blip>
+                    <a:stretch>
+                      <a:fillRect/>
+                    </a:stretch>
+                  </pic:blipFill>
+                  <pic:spPr>
+                    <a:xfrm>
+                      <a:off x="0" y="0"/>
+                      <a:ext cx="2694463" cy="2020848"/>
+                    </a:xfrm>
+                    <a:prstGeom prst="rect">
+                      <a:avLst/>
+                    </a:prstGeom>
+                  </pic:spPr>
+                </pic:pic>
+              </a:graphicData>
+            </a:graphic>
+          </wp:inline>
+        </w:drawing>
+      </w:r>
+      <w:r>
+        <w:rPr>
+          <w:rFonts w:ascii="Times New Roman" w:hAnsi="Times New Roman" w:cs="Times New Roman"/>
+          <w:noProof/>
+        </w:rPr>
+        <w:drawing>
+          <wp:inline distT="0" distB="0" distL="0" distR="0" wp14:anchorId="51C102CC" wp14:editId="15202A9E">
+            <wp:extent cx="2679700" cy="2009775"/>
+            <wp:effectExtent l="0" t="0" r="6350" b="9525"/>
+            <wp:docPr id="2013520049" name="Picture 19"/>
+            <wp:cNvGraphicFramePr>
+              <a:graphicFrameLocks xmlns:a="http://schemas.openxmlformats.org/drawingml/2006/main" noChangeAspect="1"/>
+            </wp:cNvGraphicFramePr>
+            <a:graphic xmlns:a="http://schemas.openxmlformats.org/drawingml/2006/main">
+              <a:graphicData uri="http://schemas.openxmlformats.org/drawingml/2006/picture">
+                <pic:pic xmlns:pic="http://schemas.openxmlformats.org/drawingml/2006/picture">
+                  <pic:nvPicPr>
+                    <pic:cNvPr id="2013520049" name="Picture 2013520049"/>
+                    <pic:cNvPicPr/>
+                  </pic:nvPicPr>
+                  <pic:blipFill>
+                    <a:blip r:embed="rId20">
+                      <a:extLst>
+                        <a:ext uri="{28A0092B-C50C-407E-A947-70E740481C1C}">
+                          <a14:useLocalDpi xmlns:a14="http://schemas.microsoft.com/office/drawing/2010/main" val="0"/>
+                        </a:ext>
+                      </a:extLst>
+                    </a:blip>
+                    <a:stretch>
+                      <a:fillRect/>
+                    </a:stretch>
+                  </pic:blipFill>
+                  <pic:spPr>
+                    <a:xfrm>
+                      <a:off x="0" y="0"/>
+                      <a:ext cx="2688551" cy="2016413"/>
+                    </a:xfrm>
+                    <a:prstGeom prst="rect">
+                      <a:avLst/>
+                    </a:prstGeom>
+                  </pic:spPr>
+                </pic:pic>
+              </a:graphicData>
+            </a:graphic>
+          </wp:inline>
+        </w:drawing>
+      </w:r>
+    </w:p>
+    <w:p>
+      <w:pPr>
+        <w:pStyle w:val="ListParagraph"/>
+        <w:tabs>
+          <w:tab w:val="right" w:pos="9360"/>
+        </w:tabs>
+        <w:rPr>
+          <w:rFonts w:ascii="Times New Roman" w:hAnsi="Times New Roman" w:cs="Times New Roman"/>
+        </w:rPr>
+      </w:pPr>
+      <w:r>
+        <w:rPr>
+          <w:rFonts w:ascii="Times New Roman" w:hAnsi="Times New Roman" w:cs="Times New Roman"/>
+        </w:rPr>
+        <w:lastRenderedPageBreak/>
+        <w:t>These tests</w:t>
+      </w:r>
+      <w:r>
+        <w:rPr>
+          <w:rFonts w:ascii="Times New Roman" w:hAnsi="Times New Roman" w:cs="Times New Roman"/>
+        </w:rPr>
+        <w:t xml:space="preserve"> ran </w:t>
+      </w:r>
+      <w:r>
+        <w:rPr>
+          <w:rFonts w:ascii="Times New Roman" w:hAnsi="Times New Roman" w:cs="Times New Roman"/>
+        </w:rPr>
+        <w:t>like</w:t>
+      </w:r>
+      <w:r>
+        <w:rPr>
+          <w:rFonts w:ascii="Times New Roman" w:hAnsi="Times New Roman" w:cs="Times New Roman"/>
+        </w:rPr>
+        <w:t xml:space="preserve"> the </w:t>
+      </w:r>
+      <w:proofErr w:type="spellStart"/>
+      <w:r>
+        <w:rPr>
+          <w:rFonts w:ascii="Times New Roman" w:hAnsi="Times New Roman" w:cs="Times New Roman"/>
+        </w:rPr>
+        <w:t>pthreads</w:t>
+      </w:r>
+      <w:proofErr w:type="spellEnd"/>
+      <w:r>
+        <w:rPr>
+          <w:rFonts w:ascii="Times New Roman" w:hAnsi="Times New Roman" w:cs="Times New Roman"/>
+        </w:rPr>
+        <w:t xml:space="preserve"> threads tests did. With it taking the most time using the least number and less time when we reached higher numbers. </w:t>
+      </w:r>
+      <w:r>
+        <w:rPr>
+          <w:rFonts w:ascii="Times New Roman" w:hAnsi="Times New Roman" w:cs="Times New Roman"/>
+        </w:rPr>
+        <w:t>Suggesting</w:t>
+      </w:r>
+      <w:r>
+        <w:rPr>
+          <w:rFonts w:ascii="Times New Roman" w:hAnsi="Times New Roman" w:cs="Times New Roman"/>
+        </w:rPr>
+        <w:t xml:space="preserve"> that they run the same, and they do because they don’t share the data between multiple nodes. The graph on the right is missing 8, and 16 CPUs. This is because that configuration was not available on </w:t>
+      </w:r>
+      <w:proofErr w:type="spellStart"/>
+      <w:r>
+        <w:rPr>
+          <w:rFonts w:ascii="Times New Roman" w:hAnsi="Times New Roman" w:cs="Times New Roman"/>
+        </w:rPr>
+        <w:t>beocat</w:t>
+      </w:r>
+      <w:proofErr w:type="spellEnd"/>
+      <w:r>
+        <w:rPr>
+          <w:rFonts w:ascii="Times New Roman" w:hAnsi="Times New Roman" w:cs="Times New Roman"/>
+        </w:rPr>
+        <w:t>. However, it still has the same trend as the other graph with a downward trend in time as the numbers become greater.</w:t>
+      </w:r>
+    </w:p>
+    <w:p>
+      <w:pPr>
+        <w:pStyle w:val="ListParagraph"/>
+        <w:tabs>
+          <w:tab w:val="right" w:pos="9360"/>
+        </w:tabs>
+        <w:rPr>
+          <w:rFonts w:ascii="Times New Roman" w:hAnsi="Times New Roman" w:cs="Times New Roman"/>
+        </w:rPr>
+      </w:pPr>
+      <w:r>
+        <w:rPr>
+          <w:rFonts w:ascii="Times New Roman" w:hAnsi="Times New Roman" w:cs="Times New Roman"/>
+        </w:rPr>
+        <w:tab/>
+        <w:t>The next test</w:t>
+      </w:r>
+      <w:r>
+        <w:rPr>
+          <w:rFonts w:ascii="Times New Roman" w:hAnsi="Times New Roman" w:cs="Times New Roman"/>
+        </w:rPr>
+        <w:t>s</w:t>
+      </w:r>
+      <w:r>
+        <w:rPr>
+          <w:rFonts w:ascii="Times New Roman" w:hAnsi="Times New Roman" w:cs="Times New Roman"/>
+        </w:rPr>
+        <w:t xml:space="preserve"> ran was the memory test. For this test the numbers stayed right around the same range. That falls in line with the other memory tests as well even though the lines in the graphs of all of them are all over the place. The results of the OpenMP memory test are below.</w:t>
+      </w:r>
+    </w:p>
+    <w:p>
+      <w:pPr>
+        <w:pStyle w:val="ListParagraph"/>
+        <w:tabs>
+          <w:tab w:val="right" w:pos="9360"/>
+        </w:tabs>
+        <w:rPr>
+          <w:rFonts w:ascii="Times New Roman" w:hAnsi="Times New Roman" w:cs="Times New Roman"/>
+        </w:rPr>
+      </w:pPr>
+      <w:r>
+        <w:rPr>
+          <w:rFonts w:ascii="Times New Roman" w:hAnsi="Times New Roman" w:cs="Times New Roman"/>
+          <w:noProof/>
+        </w:rPr>
+        <w:drawing>
+          <wp:inline distT="0" distB="0" distL="0" distR="0" wp14:anchorId="16E91BB9" wp14:editId="53175B98">
+            <wp:extent cx="2717800" cy="2038350"/>
+            <wp:effectExtent l="0" t="0" r="6350" b="0"/>
+            <wp:docPr id="1050511731" name="Picture 14"/>
+            <wp:cNvGraphicFramePr>
+              <a:graphicFrameLocks xmlns:a="http://schemas.openxmlformats.org/drawingml/2006/main" noChangeAspect="1"/>
+            </wp:cNvGraphicFramePr>
+            <a:graphic xmlns:a="http://schemas.openxmlformats.org/drawingml/2006/main">
+              <a:graphicData uri="http://schemas.openxmlformats.org/drawingml/2006/picture">
+                <pic:pic xmlns:pic="http://schemas.openxmlformats.org/drawingml/2006/picture">
+                  <pic:nvPicPr>
+                    <pic:cNvPr id="1050511731" name="Picture 1050511731"/>
+                    <pic:cNvPicPr/>
+                  </pic:nvPicPr>
+                  <pic:blipFill>
+                    <a:blip r:embed="rId21">
+                      <a:extLst>
+                        <a:ext uri="{28A0092B-C50C-407E-A947-70E740481C1C}">
+                          <a14:useLocalDpi xmlns:a14="http://schemas.microsoft.com/office/drawing/2010/main" val="0"/>
+                        </a:ext>
+                      </a:extLst>
+                    </a:blip>
+                    <a:stretch>
+                      <a:fillRect/>
+                    </a:stretch>
+                  </pic:blipFill>
+                  <pic:spPr>
+                    <a:xfrm>
+                      <a:off x="0" y="0"/>
+                      <a:ext cx="2733654" cy="2050241"/>
+                    </a:xfrm>
+                    <a:prstGeom prst="rect">
+                      <a:avLst/>
+                    </a:prstGeom>
+                  </pic:spPr>
+                </pic:pic>
+              </a:graphicData>
+            </a:graphic>
+          </wp:inline>
+        </w:drawing>
+      </w:r>
+      <w:r>
+        <w:rPr>
+          <w:rFonts w:ascii="Times New Roman" w:hAnsi="Times New Roman" w:cs="Times New Roman"/>
+          <w:noProof/>
+        </w:rPr>
+        <w:drawing>
+          <wp:inline distT="0" distB="0" distL="0" distR="0" wp14:anchorId="15C0D545" wp14:editId="62EBE7E7">
+            <wp:extent cx="2737556" cy="2053167"/>
+            <wp:effectExtent l="0" t="0" r="5715" b="4445"/>
+            <wp:docPr id="1981482370" name="Picture 15"/>
+            <wp:cNvGraphicFramePr>
+              <a:graphicFrameLocks xmlns:a="http://schemas.openxmlformats.org/drawingml/2006/main" noChangeAspect="1"/>
+            </wp:cNvGraphicFramePr>
+            <a:graphic xmlns:a="http://schemas.openxmlformats.org/drawingml/2006/main">
+              <a:graphicData uri="http://schemas.openxmlformats.org/drawingml/2006/picture">
+                <pic:pic xmlns:pic="http://schemas.openxmlformats.org/drawingml/2006/picture">
+                  <pic:nvPicPr>
+                    <pic:cNvPr id="1981482370" name="Picture 1981482370"/>
+                    <pic:cNvPicPr/>
+                  </pic:nvPicPr>
+                  <pic:blipFill>
+                    <a:blip r:embed="rId22">
+                      <a:extLst>
+                        <a:ext uri="{28A0092B-C50C-407E-A947-70E740481C1C}">
+                          <a14:useLocalDpi xmlns:a14="http://schemas.microsoft.com/office/drawing/2010/main" val="0"/>
+                        </a:ext>
+                      </a:extLst>
+                    </a:blip>
+                    <a:stretch>
+                      <a:fillRect/>
+                    </a:stretch>
+                  </pic:blipFill>
+                  <pic:spPr>
+                    <a:xfrm>
+                      <a:off x="0" y="0"/>
+                      <a:ext cx="2748097" cy="2061073"/>
+                    </a:xfrm>
+                    <a:prstGeom prst="rect">
+                      <a:avLst/>
+                    </a:prstGeom>
+                  </pic:spPr>
+                </pic:pic>
+              </a:graphicData>
+            </a:graphic>
+          </wp:inline>
+        </w:drawing>
+      </w:r>
+    </w:p>
+    <w:p>
+      <w:pPr>
+        <w:pStyle w:val="ListParagraph"/>
+        <w:tabs>
+          <w:tab w:val="right" w:pos="9360"/>
+        </w:tabs>
+        <w:rPr>
+          <w:rFonts w:ascii="Times New Roman" w:hAnsi="Times New Roman" w:cs="Times New Roman"/>
+        </w:rPr>
+      </w:pPr>
+      <w:r>
+        <w:rPr>
+          <w:rFonts w:ascii="Times New Roman" w:hAnsi="Times New Roman" w:cs="Times New Roman"/>
+        </w:rPr>
+        <w:t xml:space="preserve">This </w:t>
+      </w:r>
+      <w:r>
+        <w:rPr>
+          <w:rFonts w:ascii="Times New Roman" w:hAnsi="Times New Roman" w:cs="Times New Roman"/>
+        </w:rPr>
+        <w:t>suggests</w:t>
+      </w:r>
+      <w:r>
+        <w:rPr>
+          <w:rFonts w:ascii="Times New Roman" w:hAnsi="Times New Roman" w:cs="Times New Roman"/>
+        </w:rPr>
+        <w:t xml:space="preserve"> for all the implementations that memory doesn’t really affect the </w:t>
+      </w:r>
+      <w:r>
+        <w:rPr>
+          <w:rFonts w:ascii="Times New Roman" w:hAnsi="Times New Roman" w:cs="Times New Roman"/>
+        </w:rPr>
+        <w:t>running</w:t>
+      </w:r>
+      <w:r>
+        <w:rPr>
+          <w:rFonts w:ascii="Times New Roman" w:hAnsi="Times New Roman" w:cs="Times New Roman"/>
+        </w:rPr>
+        <w:t xml:space="preserve"> time. </w:t>
+      </w:r>
+      <w:r>
+        <w:rPr>
+          <w:rFonts w:ascii="Times New Roman" w:hAnsi="Times New Roman" w:cs="Times New Roman"/>
+        </w:rPr>
+        <w:t>It’s</w:t>
+      </w:r>
+      <w:r>
+        <w:rPr>
+          <w:rFonts w:ascii="Times New Roman" w:hAnsi="Times New Roman" w:cs="Times New Roman"/>
+        </w:rPr>
+        <w:t xml:space="preserve"> just the running time of the implementation that makes these numbers seem bigger or smaller between all the implementations. This similar value between all of them seems to say that </w:t>
+      </w:r>
+      <w:r>
+        <w:rPr>
+          <w:rFonts w:ascii="Times New Roman" w:hAnsi="Times New Roman" w:cs="Times New Roman"/>
+        </w:rPr>
+        <w:t>if</w:t>
+      </w:r>
+      <w:r>
+        <w:rPr>
+          <w:rFonts w:ascii="Times New Roman" w:hAnsi="Times New Roman" w:cs="Times New Roman"/>
+        </w:rPr>
+        <w:t xml:space="preserve"> there is enough memory to perform the work the numbers will be around the same. The only difference would be the noise in the background as to why these are not straight lines all the way across even with the graphs blown up in smaller margins.</w:t>
+      </w:r>
+    </w:p>
+    <w:p>
+      <w:pPr>
+        <w:pStyle w:val="ListParagraph"/>
+        <w:tabs>
+          <w:tab w:val="right" w:pos="9360"/>
+        </w:tabs>
+        <w:rPr>
+          <w:rFonts w:ascii="Times New Roman" w:hAnsi="Times New Roman" w:cs="Times New Roman"/>
+        </w:rPr>
+      </w:pPr>
+      <w:r>
+        <w:rPr>
+          <w:rFonts w:ascii="Times New Roman" w:hAnsi="Times New Roman" w:cs="Times New Roman"/>
+        </w:rPr>
+        <w:tab/>
+      </w:r>
+      <w:r>
+        <w:rPr>
+          <w:rFonts w:ascii="Times New Roman" w:hAnsi="Times New Roman" w:cs="Times New Roman"/>
+        </w:rPr>
+        <w:t xml:space="preserve">The last test that was ran was </w:t>
+      </w:r>
+      <w:r>
+        <w:rPr>
+          <w:rFonts w:ascii="Times New Roman" w:hAnsi="Times New Roman" w:cs="Times New Roman"/>
+        </w:rPr>
+        <w:t xml:space="preserve">the number of lines read. Just like the memory tests the results are similar in all three implementations. </w:t>
+      </w:r>
+    </w:p>
+    <w:p>
+      <w:pPr>
+        <w:pStyle w:val="ListParagraph"/>
+        <w:tabs>
+          <w:tab w:val="right" w:pos="9360"/>
+        </w:tabs>
+        <w:rPr>
+          <w:rFonts w:ascii="Times New Roman" w:hAnsi="Times New Roman" w:cs="Times New Roman"/>
+        </w:rPr>
+      </w:pPr>
+      <w:r>
+        <w:rPr>
+          <w:rFonts w:ascii="Times New Roman" w:hAnsi="Times New Roman" w:cs="Times New Roman"/>
+          <w:noProof/>
+        </w:rPr>
+        <w:drawing>
+          <wp:inline distT="0" distB="0" distL="0" distR="0" wp14:anchorId="18EEA4D7" wp14:editId="1B1A7F3C">
+            <wp:extent cx="2699174" cy="2024380"/>
+            <wp:effectExtent l="0" t="0" r="6350" b="0"/>
+            <wp:docPr id="220710091" name="Picture 16"/>
+            <wp:cNvGraphicFramePr>
+              <a:graphicFrameLocks xmlns:a="http://schemas.openxmlformats.org/drawingml/2006/main" noChangeAspect="1"/>
+            </wp:cNvGraphicFramePr>
+            <a:graphic xmlns:a="http://schemas.openxmlformats.org/drawingml/2006/main">
+              <a:graphicData uri="http://schemas.openxmlformats.org/drawingml/2006/picture">
+                <pic:pic xmlns:pic="http://schemas.openxmlformats.org/drawingml/2006/picture">
+                  <pic:nvPicPr>
+                    <pic:cNvPr id="220710091" name="Picture 220710091"/>
+                    <pic:cNvPicPr/>
+                  </pic:nvPicPr>
+                  <pic:blipFill>
+                    <a:blip r:embed="rId23">
+                      <a:extLst>
+                        <a:ext uri="{28A0092B-C50C-407E-A947-70E740481C1C}">
+                          <a14:useLocalDpi xmlns:a14="http://schemas.microsoft.com/office/drawing/2010/main" val="0"/>
+                        </a:ext>
+                      </a:extLst>
+                    </a:blip>
+                    <a:stretch>
+                      <a:fillRect/>
+                    </a:stretch>
+                  </pic:blipFill>
+                  <pic:spPr>
+                    <a:xfrm>
+                      <a:off x="0" y="0"/>
+                      <a:ext cx="2715892" cy="2036918"/>
+                    </a:xfrm>
+                    <a:prstGeom prst="rect">
+                      <a:avLst/>
+                    </a:prstGeom>
+                  </pic:spPr>
+                </pic:pic>
+              </a:graphicData>
+            </a:graphic>
+          </wp:inline>
+        </w:drawing>
+      </w:r>
+      <w:r>
+        <w:rPr>
+          <w:rFonts w:ascii="Times New Roman" w:hAnsi="Times New Roman" w:cs="Times New Roman"/>
+          <w:noProof/>
+        </w:rPr>
+        <w:drawing>
+          <wp:inline distT="0" distB="0" distL="0" distR="0" wp14:anchorId="6489BC26" wp14:editId="2116CD7E">
+            <wp:extent cx="2692400" cy="2019300"/>
+            <wp:effectExtent l="0" t="0" r="0" b="0"/>
+            <wp:docPr id="874107453" name="Picture 17"/>
+            <wp:cNvGraphicFramePr>
+              <a:graphicFrameLocks xmlns:a="http://schemas.openxmlformats.org/drawingml/2006/main" noChangeAspect="1"/>
+            </wp:cNvGraphicFramePr>
+            <a:graphic xmlns:a="http://schemas.openxmlformats.org/drawingml/2006/main">
+              <a:graphicData uri="http://schemas.openxmlformats.org/drawingml/2006/picture">
+                <pic:pic xmlns:pic="http://schemas.openxmlformats.org/drawingml/2006/picture">
+                  <pic:nvPicPr>
+                    <pic:cNvPr id="874107453" name="Picture 874107453"/>
+                    <pic:cNvPicPr/>
+                  </pic:nvPicPr>
+                  <pic:blipFill>
+                    <a:blip r:embed="rId24">
+                      <a:extLst>
+                        <a:ext uri="{28A0092B-C50C-407E-A947-70E740481C1C}">
+                          <a14:useLocalDpi xmlns:a14="http://schemas.microsoft.com/office/drawing/2010/main" val="0"/>
+                        </a:ext>
+                      </a:extLst>
+                    </a:blip>
+                    <a:stretch>
+                      <a:fillRect/>
+                    </a:stretch>
+                  </pic:blipFill>
+                  <pic:spPr>
+                    <a:xfrm>
+                      <a:off x="0" y="0"/>
+                      <a:ext cx="2701679" cy="2026259"/>
+                    </a:xfrm>
+                    <a:prstGeom prst="rect">
+                      <a:avLst/>
+                    </a:prstGeom>
+                  </pic:spPr>
+                </pic:pic>
+              </a:graphicData>
+            </a:graphic>
+          </wp:inline>
+        </w:drawing>
+      </w:r>
+    </w:p>
+    <w:p>
+      <w:pPr>
+        <w:pStyle w:val="ListParagraph"/>
+        <w:tabs>
+          <w:tab w:val="right" w:pos="9360"/>
+        </w:tabs>
+        <w:rPr>
+          <w:rFonts w:ascii="Times New Roman" w:hAnsi="Times New Roman" w:cs="Times New Roman"/>
+        </w:rPr>
+      </w:pPr>
+      <w:r>
+        <w:rPr>
+          <w:rFonts w:ascii="Times New Roman" w:hAnsi="Times New Roman" w:cs="Times New Roman"/>
+        </w:rPr>
+        <w:lastRenderedPageBreak/>
+        <w:t xml:space="preserve">In all of </w:t>
+      </w:r>
+      <w:r>
+        <w:rPr>
+          <w:rFonts w:ascii="Times New Roman" w:hAnsi="Times New Roman" w:cs="Times New Roman"/>
+        </w:rPr>
+        <w:t>them</w:t>
+      </w:r>
+      <w:r>
+        <w:rPr>
+          <w:rFonts w:ascii="Times New Roman" w:hAnsi="Times New Roman" w:cs="Times New Roman"/>
+        </w:rPr>
+        <w:t xml:space="preserve"> the number of lines increased the longer it took to run. This makes sense as with more lines comes more computation and manipulation to get through the increase of lines. In all tests in this OpenMP section if not all the data points </w:t>
+      </w:r>
+      <w:r>
+        <w:rPr>
+          <w:rFonts w:ascii="Times New Roman" w:hAnsi="Times New Roman" w:cs="Times New Roman"/>
+        </w:rPr>
+        <w:t>were</w:t>
+      </w:r>
+      <w:r>
+        <w:rPr>
+          <w:rFonts w:ascii="Times New Roman" w:hAnsi="Times New Roman" w:cs="Times New Roman"/>
+        </w:rPr>
+        <w:t xml:space="preserve"> present there </w:t>
+      </w:r>
+      <w:r>
+        <w:rPr>
+          <w:rFonts w:ascii="Times New Roman" w:hAnsi="Times New Roman" w:cs="Times New Roman"/>
+        </w:rPr>
+        <w:t>either not enough memory was</w:t>
+      </w:r>
+      <w:r>
+        <w:rPr>
+          <w:rFonts w:ascii="Times New Roman" w:hAnsi="Times New Roman" w:cs="Times New Roman"/>
+        </w:rPr>
+        <w:t xml:space="preserve"> to run or the configuration was not available.</w:t>
+      </w:r>
+    </w:p>
+    <w:p>
+      <w:pPr>
+        <w:pStyle w:val="ListParagraph"/>
+        <w:tabs>
+          <w:tab w:val="right" w:pos="9360"/>
+        </w:tabs>
+        <w:rPr>
+          <w:rFonts w:ascii="Times New Roman" w:hAnsi="Times New Roman" w:cs="Times New Roman"/>
+        </w:rPr>
+      </w:pPr>
+    </w:p>
+    <w:p>
+      <w:pPr>
+        <w:pStyle w:val="ListParagraph"/>
+        <w:numPr>
+          <w:ilvl w:val="0"/>
+          <w:numId w:val="1"/>
+        </w:numPr>
+        <w:tabs>
+          <w:tab w:val="right" w:pos="9360"/>
+        </w:tabs>
+        <w:rPr>
+          <w:rFonts w:ascii="Times New Roman" w:hAnsi="Times New Roman" w:cs="Times New Roman"/>
+        </w:rPr>
+      </w:pPr>
+      <w:r>
+        <w:rPr>
+          <w:rFonts w:ascii="Times New Roman" w:hAnsi="Times New Roman" w:cs="Times New Roman"/>
+        </w:rPr>
+        <w:t>Conclusion</w:t>
+      </w:r>
+    </w:p>
+    <w:p>
+      <w:pPr>
+        <w:pStyle w:val="ListParagraph"/>
+        <w:tabs>
+          <w:tab w:val="right" w:pos="9360"/>
+        </w:tabs>
+        <w:rPr>
+          <w:rFonts w:ascii="Times New Roman" w:hAnsi="Times New Roman" w:cs="Times New Roman"/>
+        </w:rPr>
+      </w:pPr>
+      <w:r>
+        <w:rPr>
+          <w:rFonts w:ascii="Times New Roman" w:hAnsi="Times New Roman" w:cs="Times New Roman"/>
+        </w:rPr>
+        <w:t xml:space="preserve">Each implementation had its strengths and weaknesses. For </w:t>
+      </w:r>
+      <w:proofErr w:type="spellStart"/>
+      <w:r>
+        <w:rPr>
+          <w:rFonts w:ascii="Times New Roman" w:hAnsi="Times New Roman" w:cs="Times New Roman"/>
+        </w:rPr>
+        <w:t>Pthreads</w:t>
+      </w:r>
+      <w:proofErr w:type="spellEnd"/>
+      <w:r>
+        <w:rPr>
+          <w:rFonts w:ascii="Times New Roman" w:hAnsi="Times New Roman" w:cs="Times New Roman"/>
+        </w:rPr>
+        <w:t xml:space="preserve"> it was efficient as it only used one node to run the data through. If we used a bigger number of lines to process the MPI would have </w:t>
+      </w:r>
+      <w:r>
+        <w:rPr>
+          <w:rFonts w:ascii="Times New Roman" w:hAnsi="Times New Roman" w:cs="Times New Roman"/>
+        </w:rPr>
+        <w:t>come</w:t>
+      </w:r>
+      <w:r>
+        <w:rPr>
+          <w:rFonts w:ascii="Times New Roman" w:hAnsi="Times New Roman" w:cs="Times New Roman"/>
+        </w:rPr>
+        <w:t xml:space="preserve"> closer to being </w:t>
+      </w:r>
+      <w:r>
+        <w:rPr>
+          <w:rFonts w:ascii="Times New Roman" w:hAnsi="Times New Roman" w:cs="Times New Roman"/>
+        </w:rPr>
+        <w:t>like</w:t>
+      </w:r>
+      <w:r>
+        <w:rPr>
+          <w:rFonts w:ascii="Times New Roman" w:hAnsi="Times New Roman" w:cs="Times New Roman"/>
+        </w:rPr>
+        <w:t xml:space="preserve"> </w:t>
+      </w:r>
+      <w:proofErr w:type="spellStart"/>
+      <w:r>
+        <w:rPr>
+          <w:rFonts w:ascii="Times New Roman" w:hAnsi="Times New Roman" w:cs="Times New Roman"/>
+        </w:rPr>
+        <w:t>pthreads</w:t>
+      </w:r>
+      <w:proofErr w:type="spellEnd"/>
+      <w:r>
+        <w:rPr>
+          <w:rFonts w:ascii="Times New Roman" w:hAnsi="Times New Roman" w:cs="Times New Roman"/>
+        </w:rPr>
+        <w:t xml:space="preserve">. The </w:t>
+      </w:r>
+      <w:r>
+        <w:rPr>
+          <w:rFonts w:ascii="Times New Roman" w:hAnsi="Times New Roman" w:cs="Times New Roman"/>
+        </w:rPr>
+        <w:t>downside</w:t>
+      </w:r>
+      <w:r>
+        <w:rPr>
+          <w:rFonts w:ascii="Times New Roman" w:hAnsi="Times New Roman" w:cs="Times New Roman"/>
+        </w:rPr>
         <w:t xml:space="preserve"> of </w:t>
       </w:r>
-      <w:r>
-        <w:rPr>
-          <w:rFonts w:ascii="Times New Roman" w:hAnsi="Times New Roman" w:cs="Times New Roman"/>
-        </w:rPr>
-        <w:lastRenderedPageBreak/>
-        <w:t xml:space="preserve">inconsistencies with the data. Too big to be considered for the averages shown in the graphs as the times were jumping all around. For that purpose, those times were considered outliers and dropped for the </w:t>
-      </w:r>
-      <w:r>
-        <w:rPr>
-          <w:rFonts w:ascii="Times New Roman" w:hAnsi="Times New Roman" w:cs="Times New Roman"/>
-        </w:rPr>
-        <w:t>purpose</w:t>
-      </w:r>
-      <w:r>
-        <w:rPr>
-          <w:rFonts w:ascii="Times New Roman" w:hAnsi="Times New Roman" w:cs="Times New Roman"/>
-        </w:rPr>
-        <w:t xml:space="preserve"> of having the most consistent data.</w:t>
+      <w:proofErr w:type="spellStart"/>
+      <w:r>
+        <w:rPr>
+          <w:rFonts w:ascii="Times New Roman" w:hAnsi="Times New Roman" w:cs="Times New Roman"/>
+        </w:rPr>
+        <w:t>pthreads</w:t>
+      </w:r>
+      <w:proofErr w:type="spellEnd"/>
+      <w:r>
+        <w:rPr>
+          <w:rFonts w:ascii="Times New Roman" w:hAnsi="Times New Roman" w:cs="Times New Roman"/>
+        </w:rPr>
+        <w:t xml:space="preserve"> comes when we compare it with OpenMP. As OpenMP does not manipulate the arrays as much as </w:t>
+      </w:r>
+      <w:proofErr w:type="spellStart"/>
+      <w:r>
+        <w:rPr>
+          <w:rFonts w:ascii="Times New Roman" w:hAnsi="Times New Roman" w:cs="Times New Roman"/>
+        </w:rPr>
+        <w:t>pthreads</w:t>
+      </w:r>
+      <w:proofErr w:type="spellEnd"/>
+      <w:r>
+        <w:rPr>
+          <w:rFonts w:ascii="Times New Roman" w:hAnsi="Times New Roman" w:cs="Times New Roman"/>
+        </w:rPr>
+        <w:t xml:space="preserve"> causing it to be just a tad slower on similar tests. MPI is great for big jobs that </w:t>
+      </w:r>
+      <w:proofErr w:type="spellStart"/>
+      <w:r>
+        <w:rPr>
+          <w:rFonts w:ascii="Times New Roman" w:hAnsi="Times New Roman" w:cs="Times New Roman"/>
+        </w:rPr>
+        <w:t>pthreads</w:t>
+      </w:r>
+      <w:proofErr w:type="spellEnd"/>
+      <w:r>
+        <w:rPr>
+          <w:rFonts w:ascii="Times New Roman" w:hAnsi="Times New Roman" w:cs="Times New Roman"/>
+        </w:rPr>
+        <w:t xml:space="preserve"> and OpenMP can not handle. However, for these tests it performed the worst. Trying to create similar tests for all implementations to show the outputs. If the </w:t>
+      </w:r>
+      <w:r>
+        <w:rPr>
+          <w:rFonts w:ascii="Times New Roman" w:hAnsi="Times New Roman" w:cs="Times New Roman"/>
+        </w:rPr>
+        <w:t xml:space="preserve">jobs were bigger and required more work MPI would have possibly shined but with the extra overhead and having to keep track of what data is where and combining it all back together again at the end lead to </w:t>
+      </w:r>
+      <w:r>
+        <w:rPr>
+          <w:rFonts w:ascii="Times New Roman" w:hAnsi="Times New Roman" w:cs="Times New Roman"/>
+        </w:rPr>
+        <w:t>greater</w:t>
+      </w:r>
+      <w:r>
+        <w:rPr>
+          <w:rFonts w:ascii="Times New Roman" w:hAnsi="Times New Roman" w:cs="Times New Roman"/>
+        </w:rPr>
+        <w:t xml:space="preserve"> performance numbers. OpenMP would perform the test as shown in the graphs. The performance times are lower as stated </w:t>
+      </w:r>
+      <w:proofErr w:type="gramStart"/>
+      <w:r>
+        <w:rPr>
+          <w:rFonts w:ascii="Times New Roman" w:hAnsi="Times New Roman" w:cs="Times New Roman"/>
+        </w:rPr>
+        <w:t>above</w:t>
+      </w:r>
+      <w:proofErr w:type="gramEnd"/>
+      <w:r>
+        <w:rPr>
+          <w:rFonts w:ascii="Times New Roman" w:hAnsi="Times New Roman" w:cs="Times New Roman"/>
+        </w:rPr>
+        <w:t xml:space="preserve"> the array manipulation was much smaller per row than the other implementations. The downside was the inability to run all the tests. </w:t>
+      </w:r>
+      <w:r>
+        <w:rPr>
+          <w:rFonts w:ascii="Times New Roman" w:hAnsi="Times New Roman" w:cs="Times New Roman"/>
+        </w:rPr>
+        <w:t>Sure,</w:t>
+      </w:r>
+      <w:r>
+        <w:rPr>
+          <w:rFonts w:ascii="Times New Roman" w:hAnsi="Times New Roman" w:cs="Times New Roman"/>
+        </w:rPr>
+        <w:t xml:space="preserve"> all implementations couldn’t run some of the tests depending on </w:t>
+      </w:r>
+      <w:proofErr w:type="gramStart"/>
+      <w:r>
+        <w:rPr>
+          <w:rFonts w:ascii="Times New Roman" w:hAnsi="Times New Roman" w:cs="Times New Roman"/>
+        </w:rPr>
+        <w:t>parameters</w:t>
+      </w:r>
+      <w:proofErr w:type="gramEnd"/>
+      <w:r>
+        <w:rPr>
+          <w:rFonts w:ascii="Times New Roman" w:hAnsi="Times New Roman" w:cs="Times New Roman"/>
+        </w:rPr>
+        <w:t xml:space="preserve"> but OpenMP was the one that refused the most.</w:t>
       </w:r>
     </w:p>
     <w:sectPr>

</xml_diff>